<commit_message>
updated MS Intro word doc
</commit_message>
<xml_diff>
--- a/Documents /MS Survey.Alex Fisher.copy.docx
+++ b/Documents /MS Survey.Alex Fisher.copy.docx
@@ -359,6 +359,11 @@
         <w:r>
           <w:rPr>
             <w:rStyle w:val="CommentReference"/>
+            <w:rFonts w:ascii="Times New Roman" w:eastAsia="Times New Roman" w:hAnsi="Times New Roman" w:cs="Times New Roman"/>
+            <w:kern w:val="0"/>
+            <w:sz w:val="28"/>
+            <w:szCs w:val="28"/>
+            <w14:ligatures w14:val="none"/>
           </w:rPr>
           <w:commentReference w:id="3"/>
         </w:r>
@@ -368,6 +373,11 @@
         <w:r>
           <w:rPr>
             <w:rStyle w:val="CommentReference"/>
+            <w:rFonts w:ascii="Times New Roman" w:eastAsia="Times New Roman" w:hAnsi="Times New Roman" w:cs="Times New Roman"/>
+            <w:kern w:val="0"/>
+            <w:sz w:val="28"/>
+            <w:szCs w:val="28"/>
+            <w14:ligatures w14:val="none"/>
           </w:rPr>
           <w:commentReference w:id="4"/>
         </w:r>
@@ -768,23 +778,15 @@
       </w:pPr>
       <w:r>
         <w:rPr>
-          <w:rFonts w:ascii="Times New Roman" w:eastAsia="Times New Roman" w:hAnsi="Times New Roman" w:cs="Times New Roman"/>
           <w:noProof/>
-          <w:kern w:val="0"/>
-          <w:sz w:val="28"/>
-          <w:szCs w:val="28"/>
-        </w:rPr>
-      </w:r>
-      <w:r>
-        <w:rPr>
-          <w:rFonts w:ascii="Times New Roman" w:eastAsia="Times New Roman" w:hAnsi="Times New Roman" w:cs="Times New Roman"/>
-          <w:noProof/>
-          <w:kern w:val="0"/>
-          <w:sz w:val="28"/>
-          <w:szCs w:val="28"/>
-        </w:rPr>
-        <w:pict w14:anchorId="4FC27F4C">
-          <v:rect id="_x0000_i1025" alt="" style="width:398.75pt;height:.05pt;mso-width-percent:0;mso-height-percent:0;mso-width-percent:0;mso-height-percent:0" o:hrpct="923" o:hralign="center" o:hrstd="t" o:hr="t" fillcolor="#a0a0a0" stroked="f"/>
+        </w:rPr>
+      </w:r>
+      <w:r>
+        <w:pict w14:anchorId="57928B30">
+          <v:rect id="Horizontal Line 1" o:spid="_x0000_s1032" style="width:398.75pt;height:.05pt;visibility:visible;mso-wrap-style:square;mso-left-percent:-10001;mso-top-percent:-10001;mso-position-horizontal:absolute;mso-position-horizontal-relative:char;mso-position-vertical:absolute;mso-position-vertical-relative:line;mso-left-percent:-10001;mso-top-percent:-10001;v-text-anchor:top" o:gfxdata="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" filled="f">
+            <o:lock v:ext="edit" rotation="t" aspectratio="t" verticies="t" text="t" shapetype="t"/>
+            <w10:anchorlock/>
+          </v:rect>
         </w:pict>
       </w:r>
     </w:p>
@@ -824,6 +826,11 @@
         <w:r>
           <w:rPr>
             <w:rStyle w:val="CommentReference"/>
+            <w:rFonts w:ascii="Times New Roman" w:eastAsia="Times New Roman" w:hAnsi="Times New Roman" w:cs="Times New Roman"/>
+            <w:kern w:val="0"/>
+            <w:sz w:val="28"/>
+            <w:szCs w:val="28"/>
+            <w14:ligatures w14:val="none"/>
           </w:rPr>
           <w:commentReference w:id="13"/>
         </w:r>
@@ -833,6 +840,11 @@
         <w:r>
           <w:rPr>
             <w:rStyle w:val="CommentReference"/>
+            <w:rFonts w:ascii="Times New Roman" w:eastAsia="Times New Roman" w:hAnsi="Times New Roman" w:cs="Times New Roman"/>
+            <w:kern w:val="0"/>
+            <w:sz w:val="28"/>
+            <w:szCs w:val="28"/>
+            <w14:ligatures w14:val="none"/>
           </w:rPr>
           <w:commentReference w:id="14"/>
         </w:r>
@@ -1060,7 +1072,29 @@
           <w14:ligatures w14:val="none"/>
         </w:rPr>
         <w:lastRenderedPageBreak/>
-        <w:t>To produce eggs/meat for my household</w:t>
+        <w:t xml:space="preserve">To produce </w:t>
+      </w:r>
+      <w:ins w:id="26" w:author="Alex Fisher" w:date="2026-03-03T13:27:00Z" w16du:dateUtc="2026-03-03T19:27:00Z">
+        <w:r>
+          <w:rPr>
+            <w:rFonts w:ascii="Times New Roman" w:eastAsia="Times New Roman" w:hAnsi="Times New Roman" w:cs="Times New Roman"/>
+            <w:kern w:val="0"/>
+            <w:sz w:val="28"/>
+            <w:szCs w:val="28"/>
+            <w14:ligatures w14:val="none"/>
+          </w:rPr>
+          <w:t xml:space="preserve">cheaper </w:t>
+        </w:r>
+      </w:ins>
+      <w:r>
+        <w:rPr>
+          <w:rFonts w:ascii="Times New Roman" w:eastAsia="Times New Roman" w:hAnsi="Times New Roman" w:cs="Times New Roman"/>
+          <w:kern w:val="0"/>
+          <w:sz w:val="28"/>
+          <w:szCs w:val="28"/>
+          <w14:ligatures w14:val="none"/>
+        </w:rPr>
+        <w:t>eggs/meat for my household</w:t>
       </w:r>
       <w:r>
         <w:rPr>
@@ -1102,6 +1136,11 @@
       <w:r>
         <w:rPr>
           <w:rStyle w:val="CommentReference"/>
+          <w:rFonts w:ascii="Times New Roman" w:eastAsia="Times New Roman" w:hAnsi="Times New Roman" w:cs="Times New Roman"/>
+          <w:kern w:val="0"/>
+          <w:sz w:val="28"/>
+          <w:szCs w:val="28"/>
+          <w14:ligatures w14:val="none"/>
         </w:rPr>
         <w:commentReference w:id="25"/>
       </w:r>
@@ -1308,33 +1347,36 @@
         </w:numPr>
         <w:spacing w:after="0" w:line="240" w:lineRule="auto"/>
         <w:rPr>
-          <w:rFonts w:ascii="Times New Roman" w:eastAsia="Times New Roman" w:hAnsi="Times New Roman" w:cs="Times New Roman"/>
-          <w:kern w:val="0"/>
-          <w:sz w:val="28"/>
-          <w:szCs w:val="28"/>
-          <w14:ligatures w14:val="none"/>
-        </w:rPr>
-      </w:pPr>
-      <w:r>
-        <w:rPr>
-          <w:rFonts w:ascii="Times New Roman" w:eastAsia="Times New Roman" w:hAnsi="Times New Roman" w:cs="Times New Roman"/>
-          <w:kern w:val="0"/>
-          <w:sz w:val="28"/>
-          <w:szCs w:val="28"/>
-          <w14:ligatures w14:val="none"/>
-        </w:rPr>
-        <w:t>To reduce my environmental footprint</w:t>
-      </w:r>
-      <w:r>
-        <w:rPr>
-          <w:rFonts w:ascii="Times New Roman" w:eastAsia="Times New Roman" w:hAnsi="Times New Roman" w:cs="Times New Roman"/>
-          <w:kern w:val="0"/>
-          <w:sz w:val="28"/>
-          <w:szCs w:val="28"/>
-          <w14:ligatures w14:val="none"/>
-        </w:rPr>
-        <w:t>___</w:t>
-      </w:r>
+          <w:del w:id="27" w:author="Alex Fisher" w:date="2026-03-03T13:27:00Z" w16du:dateUtc="2026-03-03T19:27:00Z"/>
+          <w:rFonts w:ascii="Times New Roman" w:eastAsia="Times New Roman" w:hAnsi="Times New Roman" w:cs="Times New Roman"/>
+          <w:kern w:val="0"/>
+          <w:sz w:val="28"/>
+          <w:szCs w:val="28"/>
+          <w14:ligatures w14:val="none"/>
+        </w:rPr>
+      </w:pPr>
+      <w:del w:id="28" w:author="Alex Fisher" w:date="2026-03-03T13:27:00Z" w16du:dateUtc="2026-03-03T19:27:00Z">
+        <w:r>
+          <w:rPr>
+            <w:rFonts w:ascii="Times New Roman" w:eastAsia="Times New Roman" w:hAnsi="Times New Roman" w:cs="Times New Roman"/>
+            <w:kern w:val="0"/>
+            <w:sz w:val="28"/>
+            <w:szCs w:val="28"/>
+            <w14:ligatures w14:val="none"/>
+          </w:rPr>
+          <w:delText>To reduce my environmental footprint</w:delText>
+        </w:r>
+        <w:r>
+          <w:rPr>
+            <w:rFonts w:ascii="Times New Roman" w:eastAsia="Times New Roman" w:hAnsi="Times New Roman" w:cs="Times New Roman"/>
+            <w:kern w:val="0"/>
+            <w:sz w:val="28"/>
+            <w:szCs w:val="28"/>
+            <w14:ligatures w14:val="none"/>
+          </w:rPr>
+          <w:delText>___</w:delText>
+        </w:r>
+      </w:del>
     </w:p>
     <w:p>
       <w:pPr>
@@ -1367,15 +1409,15 @@
         <w:pStyle w:val="ListParagraph"/>
         <w:spacing w:after="0" w:line="240" w:lineRule="auto"/>
         <w:rPr>
-          <w:ins w:id="26" w:author="Kelsey McCune" w:date="2026-03-02T08:30:00Z" w16du:dateUtc="2026-03-02T14:30:00Z"/>
-          <w:rFonts w:ascii="Times New Roman" w:eastAsia="Times New Roman" w:hAnsi="Times New Roman" w:cs="Times New Roman"/>
-          <w:kern w:val="0"/>
-          <w:sz w:val="28"/>
-          <w:szCs w:val="28"/>
-          <w14:ligatures w14:val="none"/>
-          <w:rPrChange w:id="27" w:author="Kelsey McCune" w:date="2026-03-02T08:30:00Z" w16du:dateUtc="2026-03-02T14:30:00Z">
+          <w:ins w:id="29" w:author="Kelsey McCune" w:date="2026-03-02T08:30:00Z" w16du:dateUtc="2026-03-02T14:30:00Z"/>
+          <w:rFonts w:ascii="Times New Roman" w:eastAsia="Times New Roman" w:hAnsi="Times New Roman" w:cs="Times New Roman"/>
+          <w:kern w:val="0"/>
+          <w:sz w:val="28"/>
+          <w:szCs w:val="28"/>
+          <w14:ligatures w14:val="none"/>
+          <w:rPrChange w:id="30" w:author="Kelsey McCune" w:date="2026-03-02T08:30:00Z" w16du:dateUtc="2026-03-02T14:30:00Z">
             <w:rPr>
-              <w:ins w:id="28" w:author="Kelsey McCune" w:date="2026-03-02T08:30:00Z" w16du:dateUtc="2026-03-02T14:30:00Z"/>
+              <w:ins w:id="31" w:author="Kelsey McCune" w:date="2026-03-02T08:30:00Z" w16du:dateUtc="2026-03-02T14:30:00Z"/>
               <w:rFonts w:ascii="Times New Roman" w:eastAsia="Times New Roman" w:hAnsi="Times New Roman" w:cs="Times New Roman"/>
               <w:b/>
               <w:bCs/>
@@ -1386,7 +1428,7 @@
             </w:rPr>
           </w:rPrChange>
         </w:rPr>
-        <w:pPrChange w:id="29" w:author="Kelsey McCune" w:date="2026-03-02T08:30:00Z" w16du:dateUtc="2026-03-02T14:30:00Z">
+        <w:pPrChange w:id="32" w:author="Kelsey McCune" w:date="2026-03-02T08:30:00Z" w16du:dateUtc="2026-03-02T14:30:00Z">
           <w:pPr>
             <w:pStyle w:val="ListParagraph"/>
             <w:numPr>
@@ -1417,7 +1459,7 @@
           <w14:ligatures w14:val="none"/>
         </w:rPr>
       </w:pPr>
-      <w:del w:id="30" w:author="Kelsey McCune" w:date="2026-03-02T08:30:00Z" w16du:dateUtc="2026-03-02T14:30:00Z">
+      <w:del w:id="33" w:author="Kelsey McCune" w:date="2026-03-02T08:30:00Z" w16du:dateUtc="2026-03-02T14:30:00Z">
         <w:r>
           <w:rPr>
             <w:rFonts w:ascii="Times New Roman" w:eastAsia="Times New Roman" w:hAnsi="Times New Roman" w:cs="Times New Roman"/>
@@ -1532,23 +1574,15 @@
       </w:pPr>
       <w:r>
         <w:rPr>
-          <w:rFonts w:ascii="Times New Roman" w:eastAsia="Times New Roman" w:hAnsi="Times New Roman" w:cs="Times New Roman"/>
           <w:noProof/>
-          <w:kern w:val="0"/>
-          <w:sz w:val="28"/>
-          <w:szCs w:val="28"/>
-        </w:rPr>
-      </w:r>
-      <w:r>
-        <w:rPr>
-          <w:rFonts w:ascii="Times New Roman" w:eastAsia="Times New Roman" w:hAnsi="Times New Roman" w:cs="Times New Roman"/>
-          <w:noProof/>
-          <w:kern w:val="0"/>
-          <w:sz w:val="28"/>
-          <w:szCs w:val="28"/>
-        </w:rPr>
-        <w:pict w14:anchorId="611566C0">
-          <v:rect id="_x0000_i1026" alt="" style="width:468pt;height:.05pt;mso-width-percent:0;mso-height-percent:0;mso-width-percent:0;mso-height-percent:0" o:hralign="center" o:hrstd="t" o:hr="t" fillcolor="#a0a0a0" stroked="f"/>
+        </w:rPr>
+      </w:r>
+      <w:r>
+        <w:pict w14:anchorId="2320C939">
+          <v:rect id="Horizontal Line 2" o:spid="_x0000_s1031" style="width:468pt;height:.05pt;visibility:visible;mso-wrap-style:square;mso-left-percent:-10001;mso-top-percent:-10001;mso-position-horizontal:absolute;mso-position-horizontal-relative:char;mso-position-vertical:absolute;mso-position-vertical-relative:line;mso-left-percent:-10001;mso-top-percent:-10001;v-text-anchor:top" o:gfxdata="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" filled="f">
+            <o:lock v:ext="edit" rotation="t" aspectratio="t" verticies="t" text="t" shapetype="t"/>
+            <w10:anchorlock/>
+          </v:rect>
         </w:pict>
       </w:r>
     </w:p>
@@ -1966,9 +2000,43 @@
           <w:szCs w:val="28"/>
           <w14:ligatures w14:val="none"/>
         </w:rPr>
-        <w:t xml:space="preserve">I am only willing to participate in </w:t>
-      </w:r>
-      <w:commentRangeStart w:id="31"/>
+        <w:t xml:space="preserve">I </w:t>
+      </w:r>
+      <w:del w:id="34" w:author="Alex Fisher" w:date="2026-03-03T13:24:00Z" w16du:dateUtc="2026-03-03T19:24:00Z">
+        <w:r>
+          <w:rPr>
+            <w:rFonts w:ascii="Times New Roman" w:eastAsia="Times New Roman" w:hAnsi="Times New Roman" w:cs="Times New Roman"/>
+            <w:kern w:val="0"/>
+            <w:sz w:val="28"/>
+            <w:szCs w:val="28"/>
+            <w14:ligatures w14:val="none"/>
+          </w:rPr>
+          <w:delText>am only willing to</w:delText>
+        </w:r>
+      </w:del>
+      <w:ins w:id="35" w:author="Alex Fisher" w:date="2026-03-03T13:24:00Z" w16du:dateUtc="2026-03-03T19:24:00Z">
+        <w:r>
+          <w:rPr>
+            <w:rFonts w:ascii="Times New Roman" w:eastAsia="Times New Roman" w:hAnsi="Times New Roman" w:cs="Times New Roman"/>
+            <w:kern w:val="0"/>
+            <w:sz w:val="28"/>
+            <w:szCs w:val="28"/>
+            <w14:ligatures w14:val="none"/>
+          </w:rPr>
+          <w:t>would rather</w:t>
+        </w:r>
+      </w:ins>
+      <w:r>
+        <w:rPr>
+          <w:rFonts w:ascii="Times New Roman" w:eastAsia="Times New Roman" w:hAnsi="Times New Roman" w:cs="Times New Roman"/>
+          <w:kern w:val="0"/>
+          <w:sz w:val="28"/>
+          <w:szCs w:val="28"/>
+          <w14:ligatures w14:val="none"/>
+        </w:rPr>
+        <w:t xml:space="preserve"> participate in </w:t>
+      </w:r>
+      <w:commentRangeStart w:id="36"/>
       <w:r>
         <w:rPr>
           <w:rFonts w:ascii="Times New Roman" w:eastAsia="Times New Roman" w:hAnsi="Times New Roman" w:cs="Times New Roman"/>
@@ -1979,23 +2047,52 @@
         </w:rPr>
         <w:t xml:space="preserve">conservation activities </w:t>
       </w:r>
-      <w:commentRangeEnd w:id="31"/>
+      <w:commentRangeEnd w:id="36"/>
       <w:r>
         <w:rPr>
           <w:rStyle w:val="CommentReference"/>
-        </w:rPr>
-        <w:commentReference w:id="31"/>
-      </w:r>
-      <w:r>
-        <w:rPr>
-          <w:rFonts w:ascii="Times New Roman" w:eastAsia="Times New Roman" w:hAnsi="Times New Roman" w:cs="Times New Roman"/>
-          <w:kern w:val="0"/>
-          <w:sz w:val="28"/>
-          <w:szCs w:val="28"/>
-          <w14:ligatures w14:val="none"/>
-        </w:rPr>
-        <w:t>that take place on my own property.</w:t>
-      </w:r>
+          <w:rFonts w:ascii="Times New Roman" w:eastAsia="Times New Roman" w:hAnsi="Times New Roman" w:cs="Times New Roman"/>
+          <w:kern w:val="0"/>
+          <w:sz w:val="28"/>
+          <w:szCs w:val="28"/>
+          <w14:ligatures w14:val="none"/>
+        </w:rPr>
+        <w:commentReference w:id="36"/>
+      </w:r>
+      <w:r>
+        <w:rPr>
+          <w:rFonts w:ascii="Times New Roman" w:eastAsia="Times New Roman" w:hAnsi="Times New Roman" w:cs="Times New Roman"/>
+          <w:kern w:val="0"/>
+          <w:sz w:val="28"/>
+          <w:szCs w:val="28"/>
+          <w14:ligatures w14:val="none"/>
+        </w:rPr>
+        <w:t>that take place on my own property</w:t>
+      </w:r>
+      <w:ins w:id="37" w:author="Alex Fisher" w:date="2026-03-03T13:24:00Z" w16du:dateUtc="2026-03-03T19:24:00Z">
+        <w:r>
+          <w:rPr>
+            <w:rFonts w:ascii="Times New Roman" w:eastAsia="Times New Roman" w:hAnsi="Times New Roman" w:cs="Times New Roman"/>
+            <w:kern w:val="0"/>
+            <w:sz w:val="28"/>
+            <w:szCs w:val="28"/>
+            <w14:ligatures w14:val="none"/>
+          </w:rPr>
+          <w:t xml:space="preserve"> compared to elsewhere</w:t>
+        </w:r>
+      </w:ins>
+      <w:del w:id="38" w:author="Alex Fisher" w:date="2026-03-03T13:24:00Z" w16du:dateUtc="2026-03-03T19:24:00Z">
+        <w:r>
+          <w:rPr>
+            <w:rFonts w:ascii="Times New Roman" w:eastAsia="Times New Roman" w:hAnsi="Times New Roman" w:cs="Times New Roman"/>
+            <w:kern w:val="0"/>
+            <w:sz w:val="28"/>
+            <w:szCs w:val="28"/>
+            <w14:ligatures w14:val="none"/>
+          </w:rPr>
+          <w:delText>.</w:delText>
+        </w:r>
+      </w:del>
       <w:r>
         <w:rPr>
           <w:rFonts w:ascii="Times New Roman" w:eastAsia="Times New Roman" w:hAnsi="Times New Roman" w:cs="Times New Roman"/>
@@ -2026,23 +2123,15 @@
       </w:pPr>
       <w:r>
         <w:rPr>
-          <w:rFonts w:ascii="Times New Roman" w:eastAsia="Times New Roman" w:hAnsi="Times New Roman" w:cs="Times New Roman"/>
           <w:noProof/>
-          <w:kern w:val="0"/>
-          <w:sz w:val="28"/>
-          <w:szCs w:val="28"/>
-        </w:rPr>
-      </w:r>
-      <w:r>
-        <w:rPr>
-          <w:rFonts w:ascii="Times New Roman" w:eastAsia="Times New Roman" w:hAnsi="Times New Roman" w:cs="Times New Roman"/>
-          <w:noProof/>
-          <w:kern w:val="0"/>
-          <w:sz w:val="28"/>
-          <w:szCs w:val="28"/>
-        </w:rPr>
-        <w:pict w14:anchorId="124844C8">
-          <v:rect id="_x0000_i1027" alt="" style="width:468pt;height:.05pt;mso-width-percent:0;mso-height-percent:0;mso-width-percent:0;mso-height-percent:0" o:hralign="center" o:hrstd="t" o:hr="t" fillcolor="#a0a0a0" stroked="f"/>
+        </w:rPr>
+      </w:r>
+      <w:r>
+        <w:pict w14:anchorId="55F8D406">
+          <v:rect id="Horizontal Line 3" o:spid="_x0000_s1030" style="width:468pt;height:.05pt;visibility:visible;mso-wrap-style:square;mso-left-percent:-10001;mso-top-percent:-10001;mso-position-horizontal:absolute;mso-position-horizontal-relative:char;mso-position-vertical:absolute;mso-position-vertical-relative:line;mso-left-percent:-10001;mso-top-percent:-10001;v-text-anchor:top" o:gfxdata="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" filled="f">
+            <o:lock v:ext="edit" rotation="t" aspectratio="t" verticies="t" text="t" shapetype="t"/>
+            <w10:anchorlock/>
+          </v:rect>
         </w:pict>
       </w:r>
     </w:p>
@@ -2179,7 +2268,7 @@
           <w:sz w:val="28"/>
           <w:szCs w:val="28"/>
           <w14:ligatures w14:val="none"/>
-          <w:rPrChange w:id="32" w:author="Kelsey McCune" w:date="2026-03-02T08:37:00Z" w16du:dateUtc="2026-03-02T14:37:00Z">
+          <w:rPrChange w:id="39" w:author="Kelsey McCune" w:date="2026-03-02T08:37:00Z" w16du:dateUtc="2026-03-02T14:37:00Z">
             <w:rPr>
               <w:rFonts w:ascii="Times New Roman" w:eastAsia="Times New Roman" w:hAnsi="Times New Roman" w:cs="Times New Roman"/>
               <w:kern w:val="0"/>
@@ -2191,7 +2280,7 @@
         </w:rPr>
         <w:t>Salmonella</w:t>
       </w:r>
-      <w:ins w:id="33" w:author="Kelsey McCune" w:date="2026-03-02T08:37:00Z" w16du:dateUtc="2026-03-02T14:37:00Z">
+      <w:ins w:id="40" w:author="Kelsey McCune" w:date="2026-03-02T08:37:00Z" w16du:dateUtc="2026-03-02T14:37:00Z">
         <w:r>
           <w:rPr>
             <w:rFonts w:ascii="Times New Roman" w:eastAsia="Times New Roman" w:hAnsi="Times New Roman" w:cs="Times New Roman"/>
@@ -2211,7 +2300,7 @@
             <w:sz w:val="28"/>
             <w:szCs w:val="28"/>
             <w14:ligatures w14:val="none"/>
-            <w:rPrChange w:id="34" w:author="Kelsey McCune" w:date="2026-03-02T08:37:00Z" w16du:dateUtc="2026-03-02T14:37:00Z">
+            <w:rPrChange w:id="41" w:author="Kelsey McCune" w:date="2026-03-02T08:37:00Z" w16du:dateUtc="2026-03-02T14:37:00Z">
               <w:rPr>
                 <w:rFonts w:ascii="Times New Roman" w:eastAsia="Times New Roman" w:hAnsi="Times New Roman" w:cs="Times New Roman"/>
                 <w:kern w:val="0"/>
@@ -2328,7 +2417,7 @@
         </w:rPr>
         <w:t>bacteria</w:t>
       </w:r>
-      <w:ins w:id="35" w:author="Kelsey McCune" w:date="2026-03-02T08:38:00Z" w16du:dateUtc="2026-03-02T14:38:00Z">
+      <w:ins w:id="42" w:author="Kelsey McCune" w:date="2026-03-02T08:38:00Z" w16du:dateUtc="2026-03-02T14:38:00Z">
         <w:r>
           <w:rPr>
             <w:rFonts w:ascii="Times New Roman" w:eastAsia="Times New Roman" w:hAnsi="Times New Roman" w:cs="Times New Roman"/>
@@ -2350,7 +2439,7 @@
         </w:rPr>
         <w:t xml:space="preserve">) can survive and multiply, such as bird feeders, water sources, or certain </w:t>
       </w:r>
-      <w:del w:id="36" w:author="Kelsey McCune" w:date="2026-03-02T08:38:00Z" w16du:dateUtc="2026-03-02T14:38:00Z">
+      <w:del w:id="43" w:author="Kelsey McCune" w:date="2026-03-02T08:38:00Z" w16du:dateUtc="2026-03-02T14:38:00Z">
         <w:r>
           <w:rPr>
             <w:rFonts w:ascii="Times New Roman" w:eastAsia="Times New Roman" w:hAnsi="Times New Roman" w:cs="Times New Roman"/>
@@ -2511,7 +2600,7 @@
         </w:rPr>
         <w:t>How much do you know about diseases that can spread from wild birds</w:t>
       </w:r>
-      <w:ins w:id="37" w:author="Kelsey McCune" w:date="2026-03-02T08:40:00Z" w16du:dateUtc="2026-03-02T14:40:00Z">
+      <w:ins w:id="44" w:author="Kelsey McCune" w:date="2026-03-02T08:40:00Z" w16du:dateUtc="2026-03-02T14:40:00Z">
         <w:r>
           <w:rPr>
             <w:rFonts w:ascii="Times New Roman" w:eastAsia="Times New Roman" w:hAnsi="Times New Roman" w:cs="Times New Roman"/>
@@ -2659,7 +2748,7 @@
         </w:rPr>
         <w:t xml:space="preserve"> are you about the following diseases affecting birds</w:t>
       </w:r>
-      <w:ins w:id="38" w:author="Kelsey McCune" w:date="2026-03-02T08:41:00Z" w16du:dateUtc="2026-03-02T14:41:00Z">
+      <w:ins w:id="45" w:author="Kelsey McCune" w:date="2026-03-02T08:41:00Z" w16du:dateUtc="2026-03-02T14:41:00Z">
         <w:r>
           <w:rPr>
             <w:rFonts w:ascii="Times New Roman" w:eastAsia="Times New Roman" w:hAnsi="Times New Roman" w:cs="Times New Roman"/>
@@ -2887,7 +2976,7 @@
         </w:rPr>
         <w:t xml:space="preserve">; </w:t>
       </w:r>
-      <w:commentRangeStart w:id="39"/>
+      <w:commentRangeStart w:id="46"/>
       <w:r>
         <w:rPr>
           <w:rFonts w:ascii="Times New Roman" w:eastAsia="Times New Roman" w:hAnsi="Times New Roman" w:cs="Times New Roman"/>
@@ -2900,15 +2989,10 @@
         </w:rPr>
         <w:t>888= Completely unaware of it</w:t>
       </w:r>
-      <w:commentRangeEnd w:id="39"/>
+      <w:commentRangeEnd w:id="46"/>
       <w:r>
         <w:rPr>
           <w:rStyle w:val="CommentReference"/>
-        </w:rPr>
-        <w:commentReference w:id="39"/>
-      </w:r>
-      <w:r>
-        <w:rPr>
           <w:rFonts w:ascii="Times New Roman" w:eastAsia="Times New Roman" w:hAnsi="Times New Roman" w:cs="Times New Roman"/>
           <w:i/>
           <w:iCs/>
@@ -2917,6 +3001,32 @@
           <w:szCs w:val="28"/>
           <w14:ligatures w14:val="none"/>
         </w:rPr>
+        <w:commentReference w:id="46"/>
+      </w:r>
+      <w:ins w:id="47" w:author="Alex Fisher" w:date="2026-03-03T13:29:00Z" w16du:dateUtc="2026-03-03T19:29:00Z">
+        <w:r>
+          <w:rPr>
+            <w:rFonts w:ascii="Times New Roman" w:eastAsia="Times New Roman" w:hAnsi="Times New Roman" w:cs="Times New Roman"/>
+            <w:i/>
+            <w:iCs/>
+            <w:kern w:val="0"/>
+            <w:sz w:val="28"/>
+            <w:szCs w:val="28"/>
+            <w14:ligatures w14:val="none"/>
+          </w:rPr>
+          <w:t>; Not concerned?</w:t>
+        </w:r>
+      </w:ins>
+      <w:r>
+        <w:rPr>
+          <w:rFonts w:ascii="Times New Roman" w:eastAsia="Times New Roman" w:hAnsi="Times New Roman" w:cs="Times New Roman"/>
+          <w:i/>
+          <w:iCs/>
+          <w:kern w:val="0"/>
+          <w:sz w:val="28"/>
+          <w:szCs w:val="28"/>
+          <w14:ligatures w14:val="none"/>
+        </w:rPr>
         <w:t>)</w:t>
       </w:r>
     </w:p>
@@ -3048,15 +3158,15 @@
         </w:tabs>
         <w:spacing w:before="100" w:beforeAutospacing="1" w:after="100" w:afterAutospacing="1" w:line="240" w:lineRule="auto"/>
         <w:rPr>
-          <w:ins w:id="40" w:author="Kelsey McCune" w:date="2026-03-02T08:40:00Z" w16du:dateUtc="2026-03-02T14:40:00Z"/>
-          <w:rFonts w:ascii="Times New Roman" w:eastAsia="Times New Roman" w:hAnsi="Times New Roman" w:cs="Times New Roman"/>
-          <w:kern w:val="0"/>
-          <w:sz w:val="28"/>
-          <w:szCs w:val="28"/>
-          <w14:ligatures w14:val="none"/>
-        </w:rPr>
-      </w:pPr>
-      <w:commentRangeStart w:id="41"/>
+          <w:ins w:id="48" w:author="Kelsey McCune" w:date="2026-03-02T08:40:00Z" w16du:dateUtc="2026-03-02T14:40:00Z"/>
+          <w:rFonts w:ascii="Times New Roman" w:eastAsia="Times New Roman" w:hAnsi="Times New Roman" w:cs="Times New Roman"/>
+          <w:kern w:val="0"/>
+          <w:sz w:val="28"/>
+          <w:szCs w:val="28"/>
+          <w14:ligatures w14:val="none"/>
+        </w:rPr>
+      </w:pPr>
+      <w:commentRangeStart w:id="49"/>
       <w:r>
         <w:rPr>
           <w:rFonts w:ascii="Times New Roman" w:eastAsia="Times New Roman" w:hAnsi="Times New Roman" w:cs="Times New Roman"/>
@@ -3067,12 +3177,17 @@
         </w:rPr>
         <w:t xml:space="preserve">Other diseases (please specify): </w:t>
       </w:r>
-      <w:commentRangeEnd w:id="41"/>
+      <w:commentRangeEnd w:id="49"/>
       <w:r>
         <w:rPr>
           <w:rStyle w:val="CommentReference"/>
-        </w:rPr>
-        <w:commentReference w:id="41"/>
+          <w:rFonts w:ascii="Times New Roman" w:eastAsia="Times New Roman" w:hAnsi="Times New Roman" w:cs="Times New Roman"/>
+          <w:kern w:val="0"/>
+          <w:sz w:val="28"/>
+          <w:szCs w:val="28"/>
+          <w14:ligatures w14:val="none"/>
+        </w:rPr>
+        <w:commentReference w:id="49"/>
       </w:r>
       <w:r>
         <w:rPr>
@@ -3096,12 +3211,15 @@
           <w:szCs w:val="28"/>
           <w14:ligatures w14:val="none"/>
         </w:rPr>
-        <w:pPrChange w:id="42" w:author="Kelsey McCune" w:date="2026-03-02T08:40:00Z" w16du:dateUtc="2026-03-02T14:40:00Z">
+        <w:pPrChange w:id="50" w:author="Kelsey McCune" w:date="2026-03-02T08:40:00Z" w16du:dateUtc="2026-03-02T14:40:00Z">
           <w:pPr>
             <w:numPr>
               <w:ilvl w:val="1"/>
               <w:numId w:val="3"/>
             </w:numPr>
+            <w:tabs>
+              <w:tab w:val="num" w:pos="1440"/>
+            </w:tabs>
             <w:spacing w:before="100" w:beforeAutospacing="1" w:after="100" w:afterAutospacing="1" w:line="240" w:lineRule="auto"/>
             <w:ind w:left="1440" w:hanging="360"/>
           </w:pPr>
@@ -3213,7 +3331,7 @@
         </w:rPr>
         <w:t>Shared resources</w:t>
       </w:r>
-      <w:ins w:id="43" w:author="Kelsey McCune" w:date="2026-03-02T08:44:00Z" w16du:dateUtc="2026-03-02T14:44:00Z">
+      <w:ins w:id="51" w:author="Kelsey McCune" w:date="2026-03-02T08:44:00Z" w16du:dateUtc="2026-03-02T14:44:00Z">
         <w:r>
           <w:rPr>
             <w:rFonts w:ascii="Times New Roman" w:eastAsia="Times New Roman" w:hAnsi="Times New Roman" w:cs="Times New Roman"/>
@@ -3335,7 +3453,7 @@
         </w:tabs>
         <w:spacing w:before="100" w:beforeAutospacing="1" w:after="100" w:afterAutospacing="1" w:line="240" w:lineRule="auto"/>
         <w:rPr>
-          <w:ins w:id="44" w:author="Kelsey McCune" w:date="2026-03-02T08:40:00Z" w16du:dateUtc="2026-03-02T14:40:00Z"/>
+          <w:ins w:id="52" w:author="Kelsey McCune" w:date="2026-03-02T08:40:00Z" w16du:dateUtc="2026-03-02T14:40:00Z"/>
           <w:rFonts w:ascii="Times New Roman" w:eastAsia="Times New Roman" w:hAnsi="Times New Roman" w:cs="Times New Roman"/>
           <w:kern w:val="0"/>
           <w:sz w:val="28"/>
@@ -3375,12 +3493,15 @@
           <w:szCs w:val="28"/>
           <w14:ligatures w14:val="none"/>
         </w:rPr>
-        <w:pPrChange w:id="45" w:author="Kelsey McCune" w:date="2026-03-02T08:40:00Z" w16du:dateUtc="2026-03-02T14:40:00Z">
+        <w:pPrChange w:id="53" w:author="Kelsey McCune" w:date="2026-03-02T08:40:00Z" w16du:dateUtc="2026-03-02T14:40:00Z">
           <w:pPr>
             <w:numPr>
               <w:ilvl w:val="1"/>
               <w:numId w:val="3"/>
             </w:numPr>
+            <w:tabs>
+              <w:tab w:val="num" w:pos="1440"/>
+            </w:tabs>
             <w:spacing w:before="100" w:beforeAutospacing="1" w:after="100" w:afterAutospacing="1" w:line="240" w:lineRule="auto"/>
             <w:ind w:left="1440" w:hanging="360"/>
           </w:pPr>
@@ -3687,7 +3808,7 @@
         </w:tabs>
         <w:spacing w:before="100" w:beforeAutospacing="1" w:after="100" w:afterAutospacing="1" w:line="240" w:lineRule="auto"/>
         <w:rPr>
-          <w:ins w:id="46" w:author="Kelsey McCune" w:date="2026-03-02T08:45:00Z" w16du:dateUtc="2026-03-02T14:45:00Z"/>
+          <w:ins w:id="54" w:author="Kelsey McCune" w:date="2026-03-02T08:45:00Z" w16du:dateUtc="2026-03-02T14:45:00Z"/>
           <w:rFonts w:ascii="Times New Roman" w:eastAsia="Times New Roman" w:hAnsi="Times New Roman" w:cs="Times New Roman"/>
           <w:kern w:val="0"/>
           <w:sz w:val="28"/>
@@ -3727,12 +3848,15 @@
           <w:szCs w:val="28"/>
           <w14:ligatures w14:val="none"/>
         </w:rPr>
-        <w:pPrChange w:id="47" w:author="Kelsey McCune" w:date="2026-03-02T08:45:00Z" w16du:dateUtc="2026-03-02T14:45:00Z">
+        <w:pPrChange w:id="55" w:author="Kelsey McCune" w:date="2026-03-02T08:45:00Z" w16du:dateUtc="2026-03-02T14:45:00Z">
           <w:pPr>
             <w:numPr>
               <w:ilvl w:val="1"/>
               <w:numId w:val="3"/>
             </w:numPr>
+            <w:tabs>
+              <w:tab w:val="num" w:pos="1440"/>
+            </w:tabs>
             <w:spacing w:before="100" w:beforeAutospacing="1" w:after="100" w:afterAutospacing="1" w:line="240" w:lineRule="auto"/>
             <w:ind w:left="1440" w:hanging="360"/>
           </w:pPr>
@@ -3838,23 +3962,15 @@
       </w:pPr>
       <w:r>
         <w:rPr>
-          <w:rFonts w:ascii="Times New Roman" w:eastAsia="Times New Roman" w:hAnsi="Times New Roman" w:cs="Times New Roman"/>
           <w:noProof/>
-          <w:kern w:val="0"/>
-          <w:sz w:val="28"/>
-          <w:szCs w:val="28"/>
-        </w:rPr>
-      </w:r>
-      <w:r>
-        <w:rPr>
-          <w:rFonts w:ascii="Times New Roman" w:eastAsia="Times New Roman" w:hAnsi="Times New Roman" w:cs="Times New Roman"/>
-          <w:noProof/>
-          <w:kern w:val="0"/>
-          <w:sz w:val="28"/>
-          <w:szCs w:val="28"/>
-        </w:rPr>
-        <w:pict w14:anchorId="15693BD7">
-          <v:rect id="_x0000_i1028" alt="" style="width:468pt;height:.05pt;mso-width-percent:0;mso-height-percent:0;mso-width-percent:0;mso-height-percent:0" o:hralign="center" o:hrstd="t" o:hr="t" fillcolor="#a0a0a0" stroked="f"/>
+        </w:rPr>
+      </w:r>
+      <w:r>
+        <w:pict w14:anchorId="545730F0">
+          <v:rect id="Horizontal Line 4" o:spid="_x0000_s1029" style="width:468pt;height:.05pt;visibility:visible;mso-wrap-style:square;mso-left-percent:-10001;mso-top-percent:-10001;mso-position-horizontal:absolute;mso-position-horizontal-relative:char;mso-position-vertical:absolute;mso-position-vertical-relative:line;mso-left-percent:-10001;mso-top-percent:-10001;v-text-anchor:top" o:gfxdata="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" filled="f">
+            <o:lock v:ext="edit" rotation="t" aspectratio="t" verticies="t" text="t" shapetype="t"/>
+            <w10:anchorlock/>
+          </v:rect>
         </w:pict>
       </w:r>
     </w:p>
@@ -3872,7 +3988,7 @@
           <w14:ligatures w14:val="none"/>
         </w:rPr>
       </w:pPr>
-      <w:commentRangeStart w:id="48"/>
+      <w:commentRangeStart w:id="56"/>
       <w:r>
         <w:rPr>
           <w:rFonts w:ascii="Times New Roman" w:eastAsia="Times New Roman" w:hAnsi="Times New Roman" w:cs="Times New Roman"/>
@@ -3909,15 +4025,10 @@
         </w:rPr>
         <w:t xml:space="preserve">: </w:t>
       </w:r>
-      <w:commentRangeEnd w:id="48"/>
+      <w:commentRangeEnd w:id="56"/>
       <w:r>
         <w:rPr>
           <w:rStyle w:val="CommentReference"/>
-        </w:rPr>
-        <w:commentReference w:id="48"/>
-      </w:r>
-      <w:r>
-        <w:rPr>
           <w:rFonts w:ascii="Times New Roman" w:eastAsia="Times New Roman" w:hAnsi="Times New Roman" w:cs="Times New Roman"/>
           <w:b/>
           <w:bCs/>
@@ -3926,7 +4037,7 @@
           <w:szCs w:val="32"/>
           <w14:ligatures w14:val="none"/>
         </w:rPr>
-        <w:t>Feeder/Coop Maintenance &amp; Biosecurity Practices</w:t>
+        <w:commentReference w:id="56"/>
       </w:r>
       <w:r>
         <w:rPr>
@@ -3938,7 +4049,7 @@
           <w:szCs w:val="32"/>
           <w14:ligatures w14:val="none"/>
         </w:rPr>
-        <w:br/>
+        <w:t>Feeder/Coop Maintenance &amp; Biosecurity Practices</w:t>
       </w:r>
       <w:r>
         <w:rPr>
@@ -3955,6 +4066,18 @@
       <w:r>
         <w:rPr>
           <w:rFonts w:ascii="Times New Roman" w:eastAsia="Times New Roman" w:hAnsi="Times New Roman" w:cs="Times New Roman"/>
+          <w:b/>
+          <w:bCs/>
+          <w:kern w:val="0"/>
+          <w:sz w:val="32"/>
+          <w:szCs w:val="32"/>
+          <w14:ligatures w14:val="none"/>
+        </w:rPr>
+        <w:br/>
+      </w:r>
+      <w:r>
+        <w:rPr>
+          <w:rFonts w:ascii="Times New Roman" w:eastAsia="Times New Roman" w:hAnsi="Times New Roman" w:cs="Times New Roman"/>
           <w:i/>
           <w:iCs/>
           <w:kern w:val="0"/>
@@ -4042,7 +4165,7 @@
         </w:rPr>
         <w:t>ow often do you clean your bird feeders/</w:t>
       </w:r>
-      <w:del w:id="49" w:author="Kelsey McCune" w:date="2026-03-02T08:51:00Z" w16du:dateUtc="2026-03-02T14:51:00Z">
+      <w:del w:id="57" w:author="Kelsey McCune" w:date="2026-03-02T08:51:00Z" w16du:dateUtc="2026-03-02T14:51:00Z">
         <w:r>
           <w:rPr>
             <w:rFonts w:ascii="Times New Roman" w:eastAsia="Times New Roman" w:hAnsi="Times New Roman" w:cs="Times New Roman"/>
@@ -4056,7 +4179,7 @@
           <w:delText xml:space="preserve">chicken </w:delText>
         </w:r>
       </w:del>
-      <w:ins w:id="50" w:author="Kelsey McCune" w:date="2026-03-02T08:51:00Z" w16du:dateUtc="2026-03-02T14:51:00Z">
+      <w:ins w:id="58" w:author="Kelsey McCune" w:date="2026-03-02T08:51:00Z" w16du:dateUtc="2026-03-02T14:51:00Z">
         <w:r>
           <w:rPr>
             <w:rFonts w:ascii="Times New Roman" w:eastAsia="Times New Roman" w:hAnsi="Times New Roman" w:cs="Times New Roman"/>
@@ -4082,7 +4205,7 @@
           <w:t xml:space="preserve"> </w:t>
         </w:r>
       </w:ins>
-      <w:del w:id="51" w:author="Kelsey McCune" w:date="2026-03-02T08:51:00Z" w16du:dateUtc="2026-03-02T14:51:00Z">
+      <w:del w:id="59" w:author="Kelsey McCune" w:date="2026-03-02T08:51:00Z" w16du:dateUtc="2026-03-02T14:51:00Z">
         <w:r>
           <w:rPr>
             <w:rFonts w:ascii="Times New Roman" w:eastAsia="Times New Roman" w:hAnsi="Times New Roman" w:cs="Times New Roman"/>
@@ -4096,7 +4219,7 @@
           <w:delText>coops</w:delText>
         </w:r>
       </w:del>
-      <w:ins w:id="52" w:author="Kelsey McCune" w:date="2026-03-02T08:51:00Z" w16du:dateUtc="2026-03-02T14:51:00Z">
+      <w:ins w:id="60" w:author="Kelsey McCune" w:date="2026-03-02T08:51:00Z" w16du:dateUtc="2026-03-02T14:51:00Z">
         <w:r>
           <w:rPr>
             <w:rFonts w:ascii="Times New Roman" w:eastAsia="Times New Roman" w:hAnsi="Times New Roman" w:cs="Times New Roman"/>
@@ -4262,7 +4385,7 @@
         </w:tabs>
         <w:spacing w:before="100" w:beforeAutospacing="1" w:after="100" w:afterAutospacing="1" w:line="240" w:lineRule="auto"/>
         <w:rPr>
-          <w:ins w:id="53" w:author="Kelsey McCune" w:date="2026-03-02T08:47:00Z" w16du:dateUtc="2026-03-02T14:47:00Z"/>
+          <w:ins w:id="61" w:author="Kelsey McCune" w:date="2026-03-02T08:47:00Z" w16du:dateUtc="2026-03-02T14:47:00Z"/>
           <w:rFonts w:ascii="Times New Roman" w:eastAsia="Times New Roman" w:hAnsi="Times New Roman" w:cs="Times New Roman"/>
           <w:kern w:val="0"/>
           <w:sz w:val="28"/>
@@ -4292,12 +4415,15 @@
           <w:szCs w:val="28"/>
           <w14:ligatures w14:val="none"/>
         </w:rPr>
-        <w:pPrChange w:id="54" w:author="Kelsey McCune" w:date="2026-03-02T08:47:00Z" w16du:dateUtc="2026-03-02T14:47:00Z">
+        <w:pPrChange w:id="62" w:author="Kelsey McCune" w:date="2026-03-02T08:47:00Z" w16du:dateUtc="2026-03-02T14:47:00Z">
           <w:pPr>
             <w:numPr>
               <w:ilvl w:val="1"/>
               <w:numId w:val="3"/>
             </w:numPr>
+            <w:tabs>
+              <w:tab w:val="num" w:pos="1440"/>
+            </w:tabs>
             <w:spacing w:before="100" w:beforeAutospacing="1" w:after="100" w:afterAutospacing="1" w:line="240" w:lineRule="auto"/>
             <w:ind w:left="1440" w:hanging="360"/>
           </w:pPr>
@@ -4331,7 +4457,7 @@
         </w:rPr>
         <w:t>When cleaning feeders</w:t>
       </w:r>
-      <w:ins w:id="55" w:author="Kelsey McCune" w:date="2026-03-02T08:50:00Z" w16du:dateUtc="2026-03-02T14:50:00Z">
+      <w:ins w:id="63" w:author="Kelsey McCune" w:date="2026-03-02T08:50:00Z" w16du:dateUtc="2026-03-02T14:50:00Z">
         <w:r>
           <w:rPr>
             <w:rFonts w:ascii="Times New Roman" w:eastAsia="Times New Roman" w:hAnsi="Times New Roman" w:cs="Times New Roman"/>
@@ -4345,7 +4471,7 @@
           <w:t xml:space="preserve"> or poultry ar</w:t>
         </w:r>
       </w:ins>
-      <w:ins w:id="56" w:author="Kelsey McCune" w:date="2026-03-02T08:51:00Z" w16du:dateUtc="2026-03-02T14:51:00Z">
+      <w:ins w:id="64" w:author="Kelsey McCune" w:date="2026-03-02T08:51:00Z" w16du:dateUtc="2026-03-02T14:51:00Z">
         <w:r>
           <w:rPr>
             <w:rFonts w:ascii="Times New Roman" w:eastAsia="Times New Roman" w:hAnsi="Times New Roman" w:cs="Times New Roman"/>
@@ -4383,15 +4509,15 @@
         </w:tabs>
         <w:spacing w:before="100" w:beforeAutospacing="1" w:after="100" w:afterAutospacing="1" w:line="240" w:lineRule="auto"/>
         <w:rPr>
-          <w:ins w:id="57" w:author="Kelsey McCune" w:date="2026-03-02T08:49:00Z" w16du:dateUtc="2026-03-02T14:49:00Z"/>
-          <w:rFonts w:ascii="Times New Roman" w:eastAsia="Times New Roman" w:hAnsi="Times New Roman" w:cs="Times New Roman"/>
-          <w:kern w:val="0"/>
-          <w:sz w:val="28"/>
-          <w:szCs w:val="28"/>
-          <w14:ligatures w14:val="none"/>
-        </w:rPr>
-      </w:pPr>
-      <w:ins w:id="58" w:author="Kelsey McCune" w:date="2026-03-02T08:49:00Z" w16du:dateUtc="2026-03-02T14:49:00Z">
+          <w:ins w:id="65" w:author="Kelsey McCune" w:date="2026-03-02T08:49:00Z" w16du:dateUtc="2026-03-02T14:49:00Z"/>
+          <w:rFonts w:ascii="Times New Roman" w:eastAsia="Times New Roman" w:hAnsi="Times New Roman" w:cs="Times New Roman"/>
+          <w:kern w:val="0"/>
+          <w:sz w:val="28"/>
+          <w:szCs w:val="28"/>
+          <w14:ligatures w14:val="none"/>
+        </w:rPr>
+      </w:pPr>
+      <w:ins w:id="66" w:author="Kelsey McCune" w:date="2026-03-02T08:49:00Z" w16du:dateUtc="2026-03-02T14:49:00Z">
         <w:r>
           <w:rPr>
             <w:rFonts w:ascii="Times New Roman" w:eastAsia="Times New Roman" w:hAnsi="Times New Roman" w:cs="Times New Roman"/>
@@ -4432,7 +4558,7 @@
         </w:rPr>
         <w:t>Soap</w:t>
       </w:r>
-      <w:del w:id="59" w:author="Kelsey McCune" w:date="2026-03-02T08:50:00Z" w16du:dateUtc="2026-03-02T14:50:00Z">
+      <w:del w:id="67" w:author="Kelsey McCune" w:date="2026-03-02T08:50:00Z" w16du:dateUtc="2026-03-02T14:50:00Z">
         <w:r>
           <w:rPr>
             <w:rFonts w:ascii="Times New Roman" w:eastAsia="Times New Roman" w:hAnsi="Times New Roman" w:cs="Times New Roman"/>
@@ -4521,7 +4647,7 @@
           <w14:ligatures w14:val="none"/>
         </w:rPr>
       </w:pPr>
-      <w:del w:id="60" w:author="Kelsey McCune" w:date="2026-03-02T08:49:00Z" w16du:dateUtc="2026-03-02T14:49:00Z">
+      <w:del w:id="68" w:author="Kelsey McCune" w:date="2026-03-02T08:49:00Z" w16du:dateUtc="2026-03-02T14:49:00Z">
         <w:r>
           <w:rPr>
             <w:rFonts w:ascii="Times New Roman" w:eastAsia="Times New Roman" w:hAnsi="Times New Roman" w:cs="Times New Roman"/>
@@ -4533,7 +4659,7 @@
           <w:delText>Nothing</w:delText>
         </w:r>
       </w:del>
-      <w:ins w:id="61" w:author="Kelsey McCune" w:date="2026-03-02T08:49:00Z" w16du:dateUtc="2026-03-02T14:49:00Z">
+      <w:ins w:id="69" w:author="Kelsey McCune" w:date="2026-03-02T08:49:00Z" w16du:dateUtc="2026-03-02T14:49:00Z">
         <w:r>
           <w:rPr>
             <w:rFonts w:ascii="Times New Roman" w:eastAsia="Times New Roman" w:hAnsi="Times New Roman" w:cs="Times New Roman"/>
@@ -4557,7 +4683,7 @@
         </w:tabs>
         <w:spacing w:before="100" w:beforeAutospacing="1" w:after="100" w:afterAutospacing="1" w:line="240" w:lineRule="auto"/>
         <w:rPr>
-          <w:ins w:id="62" w:author="Kelsey McCune" w:date="2026-03-02T08:48:00Z" w16du:dateUtc="2026-03-02T14:48:00Z"/>
+          <w:ins w:id="70" w:author="Kelsey McCune" w:date="2026-03-02T08:48:00Z" w16du:dateUtc="2026-03-02T14:48:00Z"/>
           <w:rFonts w:ascii="Times New Roman" w:eastAsia="Times New Roman" w:hAnsi="Times New Roman" w:cs="Times New Roman"/>
           <w:kern w:val="0"/>
           <w:sz w:val="28"/>
@@ -4587,12 +4713,15 @@
           <w:szCs w:val="28"/>
           <w14:ligatures w14:val="none"/>
         </w:rPr>
-        <w:pPrChange w:id="63" w:author="Kelsey McCune" w:date="2026-03-02T08:48:00Z" w16du:dateUtc="2026-03-02T14:48:00Z">
+        <w:pPrChange w:id="71" w:author="Kelsey McCune" w:date="2026-03-02T08:48:00Z" w16du:dateUtc="2026-03-02T14:48:00Z">
           <w:pPr>
             <w:numPr>
               <w:ilvl w:val="1"/>
               <w:numId w:val="3"/>
             </w:numPr>
+            <w:tabs>
+              <w:tab w:val="num" w:pos="1440"/>
+            </w:tabs>
             <w:spacing w:before="100" w:beforeAutospacing="1" w:after="100" w:afterAutospacing="1" w:line="240" w:lineRule="auto"/>
             <w:ind w:left="1440" w:hanging="360"/>
           </w:pPr>
@@ -4663,7 +4792,7 @@
         </w:rPr>
         <w:t xml:space="preserve">How often do you see wild birds interacting with or near your </w:t>
       </w:r>
-      <w:del w:id="64" w:author="Kelsey McCune" w:date="2026-03-02T08:50:00Z" w16du:dateUtc="2026-03-02T14:50:00Z">
+      <w:del w:id="72" w:author="Kelsey McCune" w:date="2026-03-02T08:50:00Z" w16du:dateUtc="2026-03-02T14:50:00Z">
         <w:r>
           <w:rPr>
             <w:rFonts w:ascii="Times New Roman" w:eastAsia="Times New Roman" w:hAnsi="Times New Roman" w:cs="Times New Roman"/>
@@ -4677,7 +4806,7 @@
           <w:delText xml:space="preserve">chicken </w:delText>
         </w:r>
       </w:del>
-      <w:ins w:id="65" w:author="Kelsey McCune" w:date="2026-03-02T08:50:00Z" w16du:dateUtc="2026-03-02T14:50:00Z">
+      <w:ins w:id="73" w:author="Kelsey McCune" w:date="2026-03-02T08:50:00Z" w16du:dateUtc="2026-03-02T14:50:00Z">
         <w:r>
           <w:rPr>
             <w:rFonts w:ascii="Times New Roman" w:eastAsia="Times New Roman" w:hAnsi="Times New Roman" w:cs="Times New Roman"/>
@@ -4884,23 +5013,15 @@
       </w:pPr>
       <w:r>
         <w:rPr>
-          <w:rFonts w:ascii="Times New Roman" w:eastAsia="Times New Roman" w:hAnsi="Times New Roman" w:cs="Times New Roman"/>
           <w:noProof/>
-          <w:kern w:val="0"/>
-          <w:sz w:val="28"/>
-          <w:szCs w:val="28"/>
-        </w:rPr>
-      </w:r>
-      <w:r>
-        <w:rPr>
-          <w:rFonts w:ascii="Times New Roman" w:eastAsia="Times New Roman" w:hAnsi="Times New Roman" w:cs="Times New Roman"/>
-          <w:noProof/>
-          <w:kern w:val="0"/>
-          <w:sz w:val="28"/>
-          <w:szCs w:val="28"/>
-        </w:rPr>
-        <w:pict w14:anchorId="414C67B5">
-          <v:rect id="_x0000_i1029" alt="" style="width:468pt;height:.05pt;mso-width-percent:0;mso-height-percent:0;mso-width-percent:0;mso-height-percent:0" o:hralign="center" o:hrstd="t" o:hr="t" fillcolor="#a0a0a0" stroked="f"/>
+        </w:rPr>
+      </w:r>
+      <w:r>
+        <w:pict w14:anchorId="73EF4B8B">
+          <v:rect id="Horizontal Line 5" o:spid="_x0000_s1028" style="width:468pt;height:.05pt;visibility:visible;mso-wrap-style:square;mso-left-percent:-10001;mso-top-percent:-10001;mso-position-horizontal:absolute;mso-position-horizontal-relative:char;mso-position-vertical:absolute;mso-position-vertical-relative:line;mso-left-percent:-10001;mso-top-percent:-10001;v-text-anchor:top" o:gfxdata="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" filled="f">
+            <o:lock v:ext="edit" rotation="t" aspectratio="t" verticies="t" text="t" shapetype="t"/>
+            <w10:anchorlock/>
+          </v:rect>
         </w:pict>
       </w:r>
     </w:p>
@@ -5060,7 +5181,7 @@
           <w:szCs w:val="28"/>
           <w:u w:val="single"/>
           <w14:ligatures w14:val="none"/>
-          <w:rPrChange w:id="66" w:author="Kelsey McCune" w:date="2026-03-02T08:51:00Z" w16du:dateUtc="2026-03-02T14:51:00Z">
+          <w:rPrChange w:id="74" w:author="Kelsey McCune" w:date="2026-03-02T08:51:00Z" w16du:dateUtc="2026-03-02T14:51:00Z">
             <w:rPr>
               <w:rFonts w:ascii="Times New Roman" w:eastAsia="Times New Roman" w:hAnsi="Times New Roman" w:cs="Times New Roman"/>
               <w:i/>
@@ -5116,7 +5237,7 @@
         <w:lastRenderedPageBreak/>
         <w:t xml:space="preserve">In the past 12 months, have you engaged in any of the following </w:t>
       </w:r>
-      <w:del w:id="67" w:author="Kelsey McCune" w:date="2026-03-02T08:51:00Z" w16du:dateUtc="2026-03-02T14:51:00Z">
+      <w:del w:id="75" w:author="Kelsey McCune" w:date="2026-03-02T08:51:00Z" w16du:dateUtc="2026-03-02T14:51:00Z">
         <w:r>
           <w:rPr>
             <w:rFonts w:ascii="Times New Roman" w:eastAsia="Times New Roman" w:hAnsi="Times New Roman" w:cs="Times New Roman"/>
@@ -5161,7 +5282,7 @@
           <w14:ligatures w14:val="none"/>
         </w:rPr>
       </w:pPr>
-      <w:commentRangeStart w:id="68"/>
+      <w:commentRangeStart w:id="76"/>
       <w:r>
         <w:rPr>
           <w:rFonts w:ascii="Times New Roman" w:eastAsia="Times New Roman" w:hAnsi="Times New Roman" w:cs="Times New Roman"/>
@@ -5211,12 +5332,17 @@
         </w:rPr>
         <w:t xml:space="preserve">Provided shelter for wild animals </w:t>
       </w:r>
-      <w:commentRangeEnd w:id="68"/>
+      <w:commentRangeEnd w:id="76"/>
       <w:r>
         <w:rPr>
           <w:rStyle w:val="CommentReference"/>
-        </w:rPr>
-        <w:commentReference w:id="68"/>
+          <w:rFonts w:ascii="Times New Roman" w:eastAsia="Times New Roman" w:hAnsi="Times New Roman" w:cs="Times New Roman"/>
+          <w:kern w:val="0"/>
+          <w:sz w:val="28"/>
+          <w:szCs w:val="28"/>
+          <w14:ligatures w14:val="none"/>
+        </w:rPr>
+        <w:commentReference w:id="76"/>
       </w:r>
       <w:r>
         <w:rPr>
@@ -5315,7 +5441,7 @@
         </w:rPr>
         <w:t xml:space="preserve">Picked up litter </w:t>
       </w:r>
-      <w:ins w:id="69" w:author="Kelsey McCune" w:date="2026-03-02T08:53:00Z" w16du:dateUtc="2026-03-02T14:53:00Z">
+      <w:ins w:id="77" w:author="Kelsey McCune" w:date="2026-03-02T08:53:00Z" w16du:dateUtc="2026-03-02T14:53:00Z">
         <w:r>
           <w:rPr>
             <w:rFonts w:ascii="Times New Roman" w:eastAsia="Times New Roman" w:hAnsi="Times New Roman" w:cs="Times New Roman"/>
@@ -5414,7 +5540,7 @@
         </w:rPr>
         <w:t>Voted for pro-</w:t>
       </w:r>
-      <w:ins w:id="70" w:author="Kelsey McCune" w:date="2026-03-02T08:54:00Z" w16du:dateUtc="2026-03-02T14:54:00Z">
+      <w:ins w:id="78" w:author="Kelsey McCune" w:date="2026-03-02T08:54:00Z" w16du:dateUtc="2026-03-02T14:54:00Z">
         <w:r>
           <w:rPr>
             <w:rFonts w:ascii="Times New Roman" w:eastAsia="Times New Roman" w:hAnsi="Times New Roman" w:cs="Times New Roman"/>
@@ -5448,7 +5574,7 @@
         </w:tabs>
         <w:spacing w:before="100" w:beforeAutospacing="1" w:after="100" w:afterAutospacing="1" w:line="240" w:lineRule="auto"/>
         <w:rPr>
-          <w:ins w:id="71" w:author="Kelsey McCune" w:date="2026-03-02T08:54:00Z" w16du:dateUtc="2026-03-02T14:54:00Z"/>
+          <w:ins w:id="79" w:author="Kelsey McCune" w:date="2026-03-02T08:54:00Z" w16du:dateUtc="2026-03-02T14:54:00Z"/>
           <w:rFonts w:ascii="Times New Roman" w:eastAsia="Times New Roman" w:hAnsi="Times New Roman" w:cs="Times New Roman"/>
           <w:kern w:val="0"/>
           <w:sz w:val="28"/>
@@ -5485,7 +5611,7 @@
           <w14:ligatures w14:val="none"/>
         </w:rPr>
       </w:pPr>
-      <w:ins w:id="72" w:author="Kelsey McCune" w:date="2026-03-02T08:54:00Z" w16du:dateUtc="2026-03-02T14:54:00Z">
+      <w:ins w:id="80" w:author="Kelsey McCune" w:date="2026-03-02T08:54:00Z" w16du:dateUtc="2026-03-02T14:54:00Z">
         <w:r>
           <w:rPr>
             <w:rFonts w:ascii="Times New Roman" w:eastAsia="Times New Roman" w:hAnsi="Times New Roman" w:cs="Times New Roman"/>
@@ -6010,23 +6136,15 @@
       </w:pPr>
       <w:r>
         <w:rPr>
-          <w:rFonts w:ascii="Times New Roman" w:eastAsia="Times New Roman" w:hAnsi="Times New Roman" w:cs="Times New Roman"/>
           <w:noProof/>
-          <w:kern w:val="0"/>
-          <w:sz w:val="28"/>
-          <w:szCs w:val="28"/>
-        </w:rPr>
-      </w:r>
-      <w:r>
-        <w:rPr>
-          <w:rFonts w:ascii="Times New Roman" w:eastAsia="Times New Roman" w:hAnsi="Times New Roman" w:cs="Times New Roman"/>
-          <w:noProof/>
-          <w:kern w:val="0"/>
-          <w:sz w:val="28"/>
-          <w:szCs w:val="28"/>
-        </w:rPr>
-        <w:pict w14:anchorId="1E0BAA7A">
-          <v:rect id="_x0000_i1030" alt="" style="width:468pt;height:.05pt;mso-width-percent:0;mso-height-percent:0;mso-width-percent:0;mso-height-percent:0" o:hralign="center" o:hrstd="t" o:hr="t" fillcolor="#a0a0a0" stroked="f"/>
+        </w:rPr>
+      </w:r>
+      <w:r>
+        <w:pict w14:anchorId="2DDD0347">
+          <v:rect id="Horizontal Line 6" o:spid="_x0000_s1027" style="width:468pt;height:.05pt;visibility:visible;mso-wrap-style:square;mso-left-percent:-10001;mso-top-percent:-10001;mso-position-horizontal:absolute;mso-position-horizontal-relative:char;mso-position-vertical:absolute;mso-position-vertical-relative:line;mso-left-percent:-10001;mso-top-percent:-10001;v-text-anchor:top" o:gfxdata="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" filled="f">
+            <o:lock v:ext="edit" rotation="t" aspectratio="t" verticies="t" text="t" shapetype="t"/>
+            <w10:anchorlock/>
+          </v:rect>
         </w:pict>
       </w:r>
       <w:r>
@@ -6143,7 +6261,7 @@
           <w14:ligatures w14:val="none"/>
         </w:rPr>
       </w:pPr>
-      <w:del w:id="73" w:author="Kelsey McCune" w:date="2026-03-02T08:57:00Z" w16du:dateUtc="2026-03-02T14:57:00Z">
+      <w:del w:id="81" w:author="Kelsey McCune" w:date="2026-03-02T08:57:00Z" w16du:dateUtc="2026-03-02T14:57:00Z">
         <w:r>
           <w:rPr>
             <w:rFonts w:ascii="Times New Roman" w:eastAsia="Times New Roman" w:hAnsi="Times New Roman" w:cs="Times New Roman"/>
@@ -6157,7 +6275,7 @@
           <w:delText>Would you be willing</w:delText>
         </w:r>
       </w:del>
-      <w:ins w:id="74" w:author="Kelsey McCune" w:date="2026-03-02T08:57:00Z" w16du:dateUtc="2026-03-02T14:57:00Z">
+      <w:ins w:id="82" w:author="Kelsey McCune" w:date="2026-03-02T08:57:00Z" w16du:dateUtc="2026-03-02T14:57:00Z">
         <w:r>
           <w:rPr>
             <w:rFonts w:ascii="Times New Roman" w:eastAsia="Times New Roman" w:hAnsi="Times New Roman" w:cs="Times New Roman"/>
@@ -6181,33 +6299,7 @@
           <w:szCs w:val="28"/>
           <w14:ligatures w14:val="none"/>
         </w:rPr>
-        <w:t xml:space="preserve"> to </w:t>
-      </w:r>
-      <w:proofErr w:type="gramStart"/>
-      <w:r>
-        <w:rPr>
-          <w:rFonts w:ascii="Times New Roman" w:eastAsia="Times New Roman" w:hAnsi="Times New Roman" w:cs="Times New Roman"/>
-          <w:b/>
-          <w:bCs/>
-          <w:kern w:val="0"/>
-          <w:sz w:val="28"/>
-          <w:szCs w:val="28"/>
-          <w14:ligatures w14:val="none"/>
-        </w:rPr>
-        <w:t>make a donation</w:t>
-      </w:r>
-      <w:proofErr w:type="gramEnd"/>
-      <w:r>
-        <w:rPr>
-          <w:rFonts w:ascii="Times New Roman" w:eastAsia="Times New Roman" w:hAnsi="Times New Roman" w:cs="Times New Roman"/>
-          <w:b/>
-          <w:bCs/>
-          <w:kern w:val="0"/>
-          <w:sz w:val="28"/>
-          <w:szCs w:val="28"/>
-          <w14:ligatures w14:val="none"/>
-        </w:rPr>
-        <w:t xml:space="preserve"> to support bird conservation efforts if it specifically funded the following initiatives?</w:t>
+        <w:t xml:space="preserve"> to make a donation to support bird conservation efforts if it specifically funded the following initiatives?</w:t>
       </w:r>
       <w:r>
         <w:rPr>
@@ -6315,7 +6407,7 @@
         </w:rPr>
         <w:t xml:space="preserve">(e.g., habitat restoration, </w:t>
       </w:r>
-      <w:ins w:id="75" w:author="Kelsey McCune" w:date="2026-03-02T08:57:00Z" w16du:dateUtc="2026-03-02T14:57:00Z">
+      <w:ins w:id="83" w:author="Kelsey McCune" w:date="2026-03-02T08:57:00Z" w16du:dateUtc="2026-03-02T14:57:00Z">
         <w:r>
           <w:rPr>
             <w:rFonts w:ascii="Times New Roman" w:eastAsia="Times New Roman" w:hAnsi="Times New Roman" w:cs="Times New Roman"/>
@@ -6405,7 +6497,7 @@
         </w:rPr>
         <w:t xml:space="preserve">Disease prevention and monitoring programs (e.g., testing feeders for </w:t>
       </w:r>
-      <w:commentRangeStart w:id="76"/>
+      <w:commentRangeStart w:id="84"/>
       <w:r>
         <w:rPr>
           <w:rFonts w:ascii="Times New Roman" w:eastAsia="Times New Roman" w:hAnsi="Times New Roman" w:cs="Times New Roman"/>
@@ -6416,7 +6508,7 @@
         </w:rPr>
         <w:t xml:space="preserve">pathogens, public education on </w:t>
       </w:r>
-      <w:del w:id="77" w:author="Kelsey McCune" w:date="2026-03-02T08:58:00Z" w16du:dateUtc="2026-03-02T14:58:00Z">
+      <w:del w:id="85" w:author="Kelsey McCune" w:date="2026-03-02T08:58:00Z" w16du:dateUtc="2026-03-02T14:58:00Z">
         <w:r>
           <w:rPr>
             <w:rFonts w:ascii="Times New Roman" w:eastAsia="Times New Roman" w:hAnsi="Times New Roman" w:cs="Times New Roman"/>
@@ -6428,7 +6520,7 @@
           <w:delText>biosecurity</w:delText>
         </w:r>
       </w:del>
-      <w:ins w:id="78" w:author="Kelsey McCune" w:date="2026-03-02T08:58:00Z" w16du:dateUtc="2026-03-02T14:58:00Z">
+      <w:ins w:id="86" w:author="Kelsey McCune" w:date="2026-03-02T08:58:00Z" w16du:dateUtc="2026-03-02T14:58:00Z">
         <w:r>
           <w:rPr>
             <w:rFonts w:ascii="Times New Roman" w:eastAsia="Times New Roman" w:hAnsi="Times New Roman" w:cs="Times New Roman"/>
@@ -6440,7 +6532,7 @@
           <w:t>zoonotic disease</w:t>
         </w:r>
       </w:ins>
-      <w:ins w:id="79" w:author="Kelsey McCune" w:date="2026-03-02T09:00:00Z" w16du:dateUtc="2026-03-02T15:00:00Z">
+      <w:ins w:id="87" w:author="Kelsey McCune" w:date="2026-03-02T09:00:00Z" w16du:dateUtc="2026-03-02T15:00:00Z">
         <w:r>
           <w:rPr>
             <w:rFonts w:ascii="Times New Roman" w:eastAsia="Times New Roman" w:hAnsi="Times New Roman" w:cs="Times New Roman"/>
@@ -6474,7 +6566,7 @@
         </w:tabs>
         <w:spacing w:before="100" w:beforeAutospacing="1" w:after="100" w:afterAutospacing="1" w:line="240" w:lineRule="auto"/>
         <w:rPr>
-          <w:ins w:id="80" w:author="Kelsey McCune" w:date="2026-03-02T08:58:00Z" w16du:dateUtc="2026-03-02T14:58:00Z"/>
+          <w:ins w:id="88" w:author="Kelsey McCune" w:date="2026-03-02T08:58:00Z" w16du:dateUtc="2026-03-02T14:58:00Z"/>
           <w:rFonts w:ascii="Times New Roman" w:eastAsia="Times New Roman" w:hAnsi="Times New Roman" w:cs="Times New Roman"/>
           <w:kern w:val="0"/>
           <w:sz w:val="28"/>
@@ -6492,12 +6584,17 @@
         </w:rPr>
         <w:t xml:space="preserve">Community education programs </w:t>
       </w:r>
-      <w:commentRangeEnd w:id="76"/>
+      <w:commentRangeEnd w:id="84"/>
       <w:r>
         <w:rPr>
           <w:rStyle w:val="CommentReference"/>
-        </w:rPr>
-        <w:commentReference w:id="76"/>
+          <w:rFonts w:ascii="Times New Roman" w:eastAsia="Times New Roman" w:hAnsi="Times New Roman" w:cs="Times New Roman"/>
+          <w:kern w:val="0"/>
+          <w:sz w:val="28"/>
+          <w:szCs w:val="28"/>
+          <w14:ligatures w14:val="none"/>
+        </w:rPr>
+        <w:commentReference w:id="84"/>
       </w:r>
       <w:r>
         <w:rPr>
@@ -6509,7 +6606,7 @@
         </w:rPr>
         <w:t xml:space="preserve">about backyard bird </w:t>
       </w:r>
-      <w:ins w:id="81" w:author="Kelsey McCune" w:date="2026-03-02T08:58:00Z" w16du:dateUtc="2026-03-02T14:58:00Z">
+      <w:ins w:id="89" w:author="Kelsey McCune" w:date="2026-03-02T08:58:00Z" w16du:dateUtc="2026-03-02T14:58:00Z">
         <w:r>
           <w:rPr>
             <w:rFonts w:ascii="Times New Roman" w:eastAsia="Times New Roman" w:hAnsi="Times New Roman" w:cs="Times New Roman"/>
@@ -6521,7 +6618,7 @@
           <w:t xml:space="preserve">biodiversity, </w:t>
         </w:r>
       </w:ins>
-      <w:ins w:id="82" w:author="Kelsey McCune" w:date="2026-03-02T08:59:00Z" w16du:dateUtc="2026-03-02T14:59:00Z">
+      <w:ins w:id="90" w:author="Kelsey McCune" w:date="2026-03-02T08:59:00Z" w16du:dateUtc="2026-03-02T14:59:00Z">
         <w:r>
           <w:rPr>
             <w:rFonts w:ascii="Times New Roman" w:eastAsia="Times New Roman" w:hAnsi="Times New Roman" w:cs="Times New Roman"/>
@@ -6533,7 +6630,7 @@
           <w:t xml:space="preserve">bird-friendly yards and sustainability </w:t>
         </w:r>
       </w:ins>
-      <w:del w:id="83" w:author="Kelsey McCune" w:date="2026-03-02T08:59:00Z" w16du:dateUtc="2026-03-02T14:59:00Z">
+      <w:del w:id="91" w:author="Kelsey McCune" w:date="2026-03-02T08:59:00Z" w16du:dateUtc="2026-03-02T14:59:00Z">
         <w:r>
           <w:rPr>
             <w:rFonts w:ascii="Times New Roman" w:eastAsia="Times New Roman" w:hAnsi="Times New Roman" w:cs="Times New Roman"/>
@@ -6557,12 +6654,15 @@
           <w:szCs w:val="28"/>
           <w14:ligatures w14:val="none"/>
         </w:rPr>
-        <w:pPrChange w:id="84" w:author="Kelsey McCune" w:date="2026-03-02T08:58:00Z" w16du:dateUtc="2026-03-02T14:58:00Z">
+        <w:pPrChange w:id="92" w:author="Kelsey McCune" w:date="2026-03-02T08:58:00Z" w16du:dateUtc="2026-03-02T14:58:00Z">
           <w:pPr>
             <w:numPr>
               <w:ilvl w:val="1"/>
               <w:numId w:val="3"/>
             </w:numPr>
+            <w:tabs>
+              <w:tab w:val="num" w:pos="1440"/>
+            </w:tabs>
             <w:spacing w:before="100" w:beforeAutospacing="1" w:after="100" w:afterAutospacing="1" w:line="240" w:lineRule="auto"/>
             <w:ind w:left="1440" w:hanging="360"/>
           </w:pPr>
@@ -6633,7 +6733,7 @@
           <w:szCs w:val="28"/>
           <w:u w:val="single"/>
           <w14:ligatures w14:val="none"/>
-          <w:rPrChange w:id="85" w:author="Kelsey McCune" w:date="2026-03-02T09:00:00Z" w16du:dateUtc="2026-03-02T15:00:00Z">
+          <w:rPrChange w:id="93" w:author="Kelsey McCune" w:date="2026-03-02T09:00:00Z" w16du:dateUtc="2026-03-02T15:00:00Z">
             <w:rPr>
               <w:rFonts w:ascii="Times New Roman" w:eastAsia="Times New Roman" w:hAnsi="Times New Roman" w:cs="Times New Roman"/>
               <w:kern w:val="0"/>
@@ -6834,8 +6934,8 @@
           <w14:ligatures w14:val="none"/>
         </w:rPr>
       </w:pPr>
-      <w:commentRangeStart w:id="86"/>
-      <w:del w:id="87" w:author="Kelsey McCune" w:date="2026-03-02T09:04:00Z" w16du:dateUtc="2026-03-02T15:04:00Z">
+      <w:commentRangeStart w:id="94"/>
+      <w:del w:id="95" w:author="Kelsey McCune" w:date="2026-03-02T09:04:00Z" w16du:dateUtc="2026-03-02T15:04:00Z">
         <w:r>
           <w:rPr>
             <w:rFonts w:ascii="Times New Roman" w:eastAsia="Times New Roman" w:hAnsi="Times New Roman" w:cs="Times New Roman"/>
@@ -6849,7 +6949,7 @@
           <w:delText>Have you ever changed the type of seed you use to attract specific bird species</w:delText>
         </w:r>
       </w:del>
-      <w:ins w:id="88" w:author="Kelsey McCune" w:date="2026-03-02T09:04:00Z" w16du:dateUtc="2026-03-02T15:04:00Z">
+      <w:ins w:id="96" w:author="Kelsey McCune" w:date="2026-03-02T09:04:00Z" w16du:dateUtc="2026-03-02T15:04:00Z">
         <w:r>
           <w:rPr>
             <w:rFonts w:ascii="Times New Roman" w:eastAsia="Times New Roman" w:hAnsi="Times New Roman" w:cs="Times New Roman"/>
@@ -6904,7 +7004,7 @@
         </w:rPr>
         <w:t>Yes</w:t>
       </w:r>
-      <w:del w:id="89" w:author="Kelsey McCune" w:date="2026-03-02T09:04:00Z" w16du:dateUtc="2026-03-02T15:04:00Z">
+      <w:del w:id="97" w:author="Kelsey McCune" w:date="2026-03-02T09:04:00Z" w16du:dateUtc="2026-03-02T15:04:00Z">
         <w:r>
           <w:rPr>
             <w:rFonts w:ascii="Times New Roman" w:eastAsia="Times New Roman" w:hAnsi="Times New Roman" w:cs="Times New Roman"/>
@@ -6950,7 +7050,7 @@
         </w:tabs>
         <w:spacing w:before="100" w:beforeAutospacing="1" w:after="100" w:afterAutospacing="1" w:line="240" w:lineRule="auto"/>
         <w:rPr>
-          <w:ins w:id="90" w:author="Kelsey McCune" w:date="2026-03-02T09:01:00Z" w16du:dateUtc="2026-03-02T15:01:00Z"/>
+          <w:ins w:id="98" w:author="Kelsey McCune" w:date="2026-03-02T09:01:00Z" w16du:dateUtc="2026-03-02T15:01:00Z"/>
           <w:rFonts w:ascii="Times New Roman" w:eastAsia="Times New Roman" w:hAnsi="Times New Roman" w:cs="Times New Roman"/>
           <w:kern w:val="0"/>
           <w:sz w:val="28"/>
@@ -6968,12 +7068,17 @@
         </w:rPr>
         <w:t>No</w:t>
       </w:r>
-      <w:commentRangeEnd w:id="86"/>
+      <w:commentRangeEnd w:id="94"/>
       <w:r>
         <w:rPr>
           <w:rStyle w:val="CommentReference"/>
-        </w:rPr>
-        <w:commentReference w:id="86"/>
+          <w:rFonts w:ascii="Times New Roman" w:eastAsia="Times New Roman" w:hAnsi="Times New Roman" w:cs="Times New Roman"/>
+          <w:kern w:val="0"/>
+          <w:sz w:val="28"/>
+          <w:szCs w:val="28"/>
+          <w14:ligatures w14:val="none"/>
+        </w:rPr>
+        <w:commentReference w:id="94"/>
       </w:r>
     </w:p>
     <w:p>
@@ -6981,140 +7086,14 @@
         <w:spacing w:before="100" w:beforeAutospacing="1" w:after="100" w:afterAutospacing="1" w:line="240" w:lineRule="auto"/>
         <w:ind w:left="1440"/>
         <w:rPr>
-          <w:ins w:id="91" w:author="Kelsey McCune" w:date="2026-03-02T09:01:00Z" w16du:dateUtc="2026-03-02T15:01:00Z"/>
-          <w:rFonts w:ascii="Times New Roman" w:eastAsia="Times New Roman" w:hAnsi="Times New Roman" w:cs="Times New Roman"/>
-          <w:kern w:val="0"/>
-          <w:sz w:val="28"/>
-          <w:szCs w:val="28"/>
-          <w14:ligatures w14:val="none"/>
-        </w:rPr>
-        <w:pPrChange w:id="92" w:author="Kelsey McCune" w:date="2026-03-02T09:01:00Z" w16du:dateUtc="2026-03-02T15:01:00Z">
-          <w:pPr>
-            <w:numPr>
-              <w:ilvl w:val="1"/>
-              <w:numId w:val="3"/>
-            </w:numPr>
-            <w:spacing w:before="100" w:beforeAutospacing="1" w:after="100" w:afterAutospacing="1" w:line="240" w:lineRule="auto"/>
-            <w:ind w:left="1440" w:hanging="360"/>
-          </w:pPr>
-        </w:pPrChange>
-      </w:pPr>
-    </w:p>
-    <w:p>
-      <w:pPr>
-        <w:numPr>
-          <w:ilvl w:val="0"/>
-          <w:numId w:val="3"/>
-        </w:numPr>
-        <w:spacing w:before="100" w:beforeAutospacing="1" w:after="100" w:afterAutospacing="1" w:line="240" w:lineRule="auto"/>
-        <w:rPr>
-          <w:ins w:id="93" w:author="Kelsey McCune" w:date="2026-03-02T09:03:00Z" w16du:dateUtc="2026-03-02T15:03:00Z"/>
-          <w:rFonts w:ascii="Times New Roman" w:eastAsia="Times New Roman" w:hAnsi="Times New Roman" w:cs="Times New Roman"/>
-          <w:kern w:val="0"/>
-          <w:sz w:val="28"/>
-          <w:szCs w:val="28"/>
-          <w14:ligatures w14:val="none"/>
-        </w:rPr>
-      </w:pPr>
-      <w:ins w:id="94" w:author="Kelsey McCune" w:date="2026-03-02T09:03:00Z" w16du:dateUtc="2026-03-02T15:03:00Z">
-        <w:r>
-          <w:rPr>
-            <w:rFonts w:ascii="Times New Roman" w:eastAsia="Times New Roman" w:hAnsi="Times New Roman" w:cs="Times New Roman"/>
-            <w:kern w:val="0"/>
-            <w:sz w:val="28"/>
-            <w:szCs w:val="28"/>
-            <w14:ligatures w14:val="none"/>
-          </w:rPr>
-          <w:t xml:space="preserve"> How do you choose which bird seed to buy?</w:t>
-        </w:r>
-      </w:ins>
-    </w:p>
-    <w:p>
-      <w:pPr>
-        <w:numPr>
-          <w:ilvl w:val="1"/>
-          <w:numId w:val="3"/>
-        </w:numPr>
-        <w:spacing w:before="100" w:beforeAutospacing="1" w:after="100" w:afterAutospacing="1" w:line="240" w:lineRule="auto"/>
-        <w:rPr>
-          <w:ins w:id="95" w:author="Kelsey McCune" w:date="2026-03-02T09:03:00Z" w16du:dateUtc="2026-03-02T15:03:00Z"/>
-          <w:rFonts w:ascii="Times New Roman" w:eastAsia="Times New Roman" w:hAnsi="Times New Roman" w:cs="Times New Roman"/>
-          <w:kern w:val="0"/>
-          <w:sz w:val="28"/>
-          <w:szCs w:val="28"/>
-          <w14:ligatures w14:val="none"/>
-        </w:rPr>
-      </w:pPr>
-      <w:ins w:id="96" w:author="Kelsey McCune" w:date="2026-03-02T09:03:00Z" w16du:dateUtc="2026-03-02T15:03:00Z">
-        <w:r>
-          <w:rPr>
-            <w:rFonts w:ascii="Times New Roman" w:eastAsia="Times New Roman" w:hAnsi="Times New Roman" w:cs="Times New Roman"/>
-            <w:kern w:val="0"/>
-            <w:sz w:val="28"/>
-            <w:szCs w:val="28"/>
-            <w14:ligatures w14:val="none"/>
-          </w:rPr>
-          <w:t>Seed that will be the least messy</w:t>
-        </w:r>
-      </w:ins>
-    </w:p>
-    <w:p>
-      <w:pPr>
-        <w:numPr>
-          <w:ilvl w:val="1"/>
-          <w:numId w:val="3"/>
-        </w:numPr>
-        <w:spacing w:before="100" w:beforeAutospacing="1" w:after="100" w:afterAutospacing="1" w:line="240" w:lineRule="auto"/>
-        <w:rPr>
-          <w:ins w:id="97" w:author="Kelsey McCune" w:date="2026-03-02T09:06:00Z" w16du:dateUtc="2026-03-02T15:06:00Z"/>
-          <w:rFonts w:ascii="Times New Roman" w:eastAsia="Times New Roman" w:hAnsi="Times New Roman" w:cs="Times New Roman"/>
-          <w:kern w:val="0"/>
-          <w:sz w:val="28"/>
-          <w:szCs w:val="28"/>
-          <w14:ligatures w14:val="none"/>
-        </w:rPr>
-      </w:pPr>
-      <w:ins w:id="98" w:author="Kelsey McCune" w:date="2026-03-02T09:03:00Z" w16du:dateUtc="2026-03-02T15:03:00Z">
-        <w:r>
-          <w:rPr>
-            <w:rFonts w:ascii="Times New Roman" w:eastAsia="Times New Roman" w:hAnsi="Times New Roman" w:cs="Times New Roman"/>
-            <w:kern w:val="0"/>
-            <w:sz w:val="28"/>
-            <w:szCs w:val="28"/>
-            <w14:ligatures w14:val="none"/>
-          </w:rPr>
-          <w:t>Seed that wi</w:t>
-        </w:r>
-      </w:ins>
-      <w:ins w:id="99" w:author="Kelsey McCune" w:date="2026-03-02T09:04:00Z" w16du:dateUtc="2026-03-02T15:04:00Z">
-        <w:r>
-          <w:rPr>
-            <w:rFonts w:ascii="Times New Roman" w:eastAsia="Times New Roman" w:hAnsi="Times New Roman" w:cs="Times New Roman"/>
-            <w:kern w:val="0"/>
-            <w:sz w:val="28"/>
-            <w:szCs w:val="28"/>
-            <w14:ligatures w14:val="none"/>
-          </w:rPr>
-          <w:t>ll attract specific bird species</w:t>
-        </w:r>
-      </w:ins>
-    </w:p>
-    <w:p>
-      <w:pPr>
-        <w:numPr>
-          <w:ilvl w:val="2"/>
-          <w:numId w:val="3"/>
-        </w:numPr>
-        <w:spacing w:before="100" w:beforeAutospacing="1" w:after="100" w:afterAutospacing="1" w:line="240" w:lineRule="auto"/>
-        <w:rPr>
-          <w:ins w:id="100" w:author="Kelsey McCune" w:date="2026-03-02T09:04:00Z" w16du:dateUtc="2026-03-02T15:04:00Z"/>
-          <w:rFonts w:ascii="Times New Roman" w:eastAsia="Times New Roman" w:hAnsi="Times New Roman" w:cs="Times New Roman"/>
-          <w:kern w:val="0"/>
-          <w:sz w:val="28"/>
-          <w:szCs w:val="28"/>
-          <w14:ligatures w14:val="none"/>
-        </w:rPr>
-        <w:pPrChange w:id="101" w:author="Kelsey McCune" w:date="2026-03-02T09:06:00Z" w16du:dateUtc="2026-03-02T15:06:00Z">
+          <w:ins w:id="99" w:author="Kelsey McCune" w:date="2026-03-02T09:01:00Z" w16du:dateUtc="2026-03-02T15:01:00Z"/>
+          <w:rFonts w:ascii="Times New Roman" w:eastAsia="Times New Roman" w:hAnsi="Times New Roman" w:cs="Times New Roman"/>
+          <w:kern w:val="0"/>
+          <w:sz w:val="28"/>
+          <w:szCs w:val="28"/>
+          <w14:ligatures w14:val="none"/>
+        </w:rPr>
+        <w:pPrChange w:id="100" w:author="Kelsey McCune" w:date="2026-03-02T09:01:00Z" w16du:dateUtc="2026-03-02T15:01:00Z">
           <w:pPr>
             <w:numPr>
               <w:ilvl w:val="1"/>
@@ -7128,7 +7107,24 @@
           </w:pPr>
         </w:pPrChange>
       </w:pPr>
-      <w:ins w:id="102" w:author="Kelsey McCune" w:date="2026-03-02T09:06:00Z" w16du:dateUtc="2026-03-02T15:06:00Z">
+    </w:p>
+    <w:p>
+      <w:pPr>
+        <w:numPr>
+          <w:ilvl w:val="0"/>
+          <w:numId w:val="3"/>
+        </w:numPr>
+        <w:spacing w:before="100" w:beforeAutospacing="1" w:after="100" w:afterAutospacing="1" w:line="240" w:lineRule="auto"/>
+        <w:rPr>
+          <w:ins w:id="101" w:author="Kelsey McCune" w:date="2026-03-02T09:03:00Z" w16du:dateUtc="2026-03-02T15:03:00Z"/>
+          <w:rFonts w:ascii="Times New Roman" w:eastAsia="Times New Roman" w:hAnsi="Times New Roman" w:cs="Times New Roman"/>
+          <w:kern w:val="0"/>
+          <w:sz w:val="28"/>
+          <w:szCs w:val="28"/>
+          <w14:ligatures w14:val="none"/>
+        </w:rPr>
+      </w:pPr>
+      <w:ins w:id="102" w:author="Kelsey McCune" w:date="2026-03-02T09:03:00Z" w16du:dateUtc="2026-03-02T15:03:00Z">
         <w:r>
           <w:rPr>
             <w:rFonts w:ascii="Times New Roman" w:eastAsia="Times New Roman" w:hAnsi="Times New Roman" w:cs="Times New Roman"/>
@@ -7137,7 +7133,7 @@
             <w:szCs w:val="28"/>
             <w14:ligatures w14:val="none"/>
           </w:rPr>
-          <w:t>Which species?</w:t>
+          <w:t xml:space="preserve"> How do you choose which bird seed to buy?</w:t>
         </w:r>
       </w:ins>
     </w:p>
@@ -7149,15 +7145,15 @@
         </w:numPr>
         <w:spacing w:before="100" w:beforeAutospacing="1" w:after="100" w:afterAutospacing="1" w:line="240" w:lineRule="auto"/>
         <w:rPr>
-          <w:ins w:id="103" w:author="Kelsey McCune" w:date="2026-03-02T09:04:00Z" w16du:dateUtc="2026-03-02T15:04:00Z"/>
-          <w:rFonts w:ascii="Times New Roman" w:eastAsia="Times New Roman" w:hAnsi="Times New Roman" w:cs="Times New Roman"/>
-          <w:kern w:val="0"/>
-          <w:sz w:val="28"/>
-          <w:szCs w:val="28"/>
-          <w14:ligatures w14:val="none"/>
-        </w:rPr>
-      </w:pPr>
-      <w:ins w:id="104" w:author="Kelsey McCune" w:date="2026-03-02T09:04:00Z" w16du:dateUtc="2026-03-02T15:04:00Z">
+          <w:ins w:id="103" w:author="Alex Fisher" w:date="2026-03-03T13:33:00Z" w16du:dateUtc="2026-03-03T19:33:00Z"/>
+          <w:rFonts w:ascii="Times New Roman" w:eastAsia="Times New Roman" w:hAnsi="Times New Roman" w:cs="Times New Roman"/>
+          <w:kern w:val="0"/>
+          <w:sz w:val="28"/>
+          <w:szCs w:val="28"/>
+          <w14:ligatures w14:val="none"/>
+        </w:rPr>
+      </w:pPr>
+      <w:ins w:id="104" w:author="Kelsey McCune" w:date="2026-03-02T09:03:00Z" w16du:dateUtc="2026-03-02T15:03:00Z">
         <w:r>
           <w:rPr>
             <w:rFonts w:ascii="Times New Roman" w:eastAsia="Times New Roman" w:hAnsi="Times New Roman" w:cs="Times New Roman"/>
@@ -7166,7 +7162,7 @@
             <w:szCs w:val="28"/>
             <w14:ligatures w14:val="none"/>
           </w:rPr>
-          <w:t>Seed that is the healthiest for wild birds</w:t>
+          <w:t>Seed that will be the least messy</w:t>
         </w:r>
       </w:ins>
     </w:p>
@@ -7178,15 +7174,14 @@
         </w:numPr>
         <w:spacing w:before="100" w:beforeAutospacing="1" w:after="100" w:afterAutospacing="1" w:line="240" w:lineRule="auto"/>
         <w:rPr>
-          <w:ins w:id="105" w:author="Kelsey McCune" w:date="2026-03-02T09:05:00Z" w16du:dateUtc="2026-03-02T15:05:00Z"/>
-          <w:rFonts w:ascii="Times New Roman" w:eastAsia="Times New Roman" w:hAnsi="Times New Roman" w:cs="Times New Roman"/>
-          <w:kern w:val="0"/>
-          <w:sz w:val="28"/>
-          <w:szCs w:val="28"/>
-          <w14:ligatures w14:val="none"/>
-        </w:rPr>
-      </w:pPr>
-      <w:ins w:id="106" w:author="Kelsey McCune" w:date="2026-03-02T09:04:00Z" w16du:dateUtc="2026-03-02T15:04:00Z">
+          <w:rFonts w:ascii="Times New Roman" w:eastAsia="Times New Roman" w:hAnsi="Times New Roman" w:cs="Times New Roman"/>
+          <w:kern w:val="0"/>
+          <w:sz w:val="28"/>
+          <w:szCs w:val="28"/>
+          <w14:ligatures w14:val="none"/>
+        </w:rPr>
+      </w:pPr>
+      <w:ins w:id="105" w:author="Alex Fisher" w:date="2026-03-03T13:33:00Z" w16du:dateUtc="2026-03-03T19:33:00Z">
         <w:r>
           <w:rPr>
             <w:rFonts w:ascii="Times New Roman" w:eastAsia="Times New Roman" w:hAnsi="Times New Roman" w:cs="Times New Roman"/>
@@ -7195,7 +7190,7 @@
             <w:szCs w:val="28"/>
             <w14:ligatures w14:val="none"/>
           </w:rPr>
-          <w:t>Seed that is the most affordable</w:t>
+          <w:t>Seed that will deter rodent species (squirrels)</w:t>
         </w:r>
       </w:ins>
     </w:p>
@@ -7213,65 +7208,134 @@
           <w:szCs w:val="28"/>
           <w14:ligatures w14:val="none"/>
         </w:rPr>
-        <w:pPrChange w:id="107" w:author="Kelsey McCune" w:date="2026-03-02T09:03:00Z" w16du:dateUtc="2026-03-02T15:03:00Z">
+      </w:pPr>
+      <w:r>
+        <w:rPr>
+          <w:rFonts w:ascii="Times New Roman" w:eastAsia="Times New Roman" w:hAnsi="Times New Roman" w:cs="Times New Roman"/>
+          <w:kern w:val="0"/>
+          <w:sz w:val="28"/>
+          <w:szCs w:val="28"/>
+          <w14:ligatures w14:val="none"/>
+        </w:rPr>
+        <w:t>Seed that will attract specific bird species</w:t>
+      </w:r>
+    </w:p>
+    <w:p>
+      <w:pPr>
+        <w:numPr>
+          <w:ilvl w:val="2"/>
+          <w:numId w:val="3"/>
+        </w:numPr>
+        <w:spacing w:before="100" w:beforeAutospacing="1" w:after="100" w:afterAutospacing="1" w:line="240" w:lineRule="auto"/>
+        <w:rPr>
+          <w:rFonts w:ascii="Times New Roman" w:eastAsia="Times New Roman" w:hAnsi="Times New Roman" w:cs="Times New Roman"/>
+          <w:kern w:val="0"/>
+          <w:sz w:val="28"/>
+          <w:szCs w:val="28"/>
+          <w14:ligatures w14:val="none"/>
+        </w:rPr>
+        <w:pPrChange w:id="106" w:author="Alex Fisher" w:date="2026-03-03T13:32:00Z" w16du:dateUtc="2026-03-03T19:32:00Z">
           <w:pPr>
             <w:numPr>
               <w:ilvl w:val="1"/>
               <w:numId w:val="3"/>
             </w:numPr>
+            <w:tabs>
+              <w:tab w:val="num" w:pos="1440"/>
+            </w:tabs>
             <w:spacing w:before="100" w:beforeAutospacing="1" w:after="100" w:afterAutospacing="1" w:line="240" w:lineRule="auto"/>
             <w:ind w:left="1440" w:hanging="360"/>
           </w:pPr>
         </w:pPrChange>
       </w:pPr>
-      <w:ins w:id="108" w:author="Kelsey McCune" w:date="2026-03-02T09:05:00Z" w16du:dateUtc="2026-03-02T15:05:00Z">
-        <w:r>
-          <w:rPr>
-            <w:rFonts w:ascii="Times New Roman" w:eastAsia="Times New Roman" w:hAnsi="Times New Roman" w:cs="Times New Roman"/>
-            <w:kern w:val="0"/>
-            <w:sz w:val="28"/>
-            <w:szCs w:val="28"/>
-            <w14:ligatures w14:val="none"/>
-          </w:rPr>
-          <w:t xml:space="preserve">Seed that was recommended by </w:t>
-        </w:r>
-      </w:ins>
-      <w:ins w:id="109" w:author="Kelsey McCune" w:date="2026-03-02T09:06:00Z" w16du:dateUtc="2026-03-02T15:06:00Z">
-        <w:r>
-          <w:rPr>
-            <w:rFonts w:ascii="Times New Roman" w:eastAsia="Times New Roman" w:hAnsi="Times New Roman" w:cs="Times New Roman"/>
-            <w:kern w:val="0"/>
-            <w:sz w:val="28"/>
-            <w:szCs w:val="28"/>
-            <w14:ligatures w14:val="none"/>
-          </w:rPr>
-          <w:t>store personnel</w:t>
-        </w:r>
-      </w:ins>
-      <w:ins w:id="110" w:author="Kelsey McCune" w:date="2026-03-02T09:05:00Z" w16du:dateUtc="2026-03-02T15:05:00Z">
-        <w:r>
-          <w:rPr>
-            <w:rFonts w:ascii="Times New Roman" w:eastAsia="Times New Roman" w:hAnsi="Times New Roman" w:cs="Times New Roman"/>
-            <w:kern w:val="0"/>
-            <w:sz w:val="28"/>
-            <w:szCs w:val="28"/>
-            <w14:ligatures w14:val="none"/>
-          </w:rPr>
-          <w:t>/social media/</w:t>
-        </w:r>
-      </w:ins>
-      <w:ins w:id="111" w:author="Kelsey McCune" w:date="2026-03-02T09:06:00Z" w16du:dateUtc="2026-03-02T15:06:00Z">
-        <w:r>
-          <w:rPr>
-            <w:rFonts w:ascii="Times New Roman" w:eastAsia="Times New Roman" w:hAnsi="Times New Roman" w:cs="Times New Roman"/>
-            <w:kern w:val="0"/>
-            <w:sz w:val="28"/>
-            <w:szCs w:val="28"/>
-            <w14:ligatures w14:val="none"/>
-          </w:rPr>
-          <w:t>news articles</w:t>
-        </w:r>
-      </w:ins>
+      <w:r>
+        <w:rPr>
+          <w:rFonts w:ascii="Times New Roman" w:eastAsia="Times New Roman" w:hAnsi="Times New Roman" w:cs="Times New Roman"/>
+          <w:kern w:val="0"/>
+          <w:sz w:val="28"/>
+          <w:szCs w:val="28"/>
+          <w14:ligatures w14:val="none"/>
+        </w:rPr>
+        <w:t>Which species?</w:t>
+      </w:r>
+    </w:p>
+    <w:p>
+      <w:pPr>
+        <w:numPr>
+          <w:ilvl w:val="1"/>
+          <w:numId w:val="3"/>
+        </w:numPr>
+        <w:spacing w:before="100" w:beforeAutospacing="1" w:after="100" w:afterAutospacing="1" w:line="240" w:lineRule="auto"/>
+        <w:rPr>
+          <w:rFonts w:ascii="Times New Roman" w:eastAsia="Times New Roman" w:hAnsi="Times New Roman" w:cs="Times New Roman"/>
+          <w:kern w:val="0"/>
+          <w:sz w:val="28"/>
+          <w:szCs w:val="28"/>
+          <w14:ligatures w14:val="none"/>
+        </w:rPr>
+      </w:pPr>
+      <w:r>
+        <w:rPr>
+          <w:rFonts w:ascii="Times New Roman" w:eastAsia="Times New Roman" w:hAnsi="Times New Roman" w:cs="Times New Roman"/>
+          <w:kern w:val="0"/>
+          <w:sz w:val="28"/>
+          <w:szCs w:val="28"/>
+          <w14:ligatures w14:val="none"/>
+        </w:rPr>
+        <w:t>Seed that is the healthiest for wild birds</w:t>
+      </w:r>
+    </w:p>
+    <w:p>
+      <w:pPr>
+        <w:numPr>
+          <w:ilvl w:val="1"/>
+          <w:numId w:val="3"/>
+        </w:numPr>
+        <w:spacing w:before="100" w:beforeAutospacing="1" w:after="100" w:afterAutospacing="1" w:line="240" w:lineRule="auto"/>
+        <w:rPr>
+          <w:rFonts w:ascii="Times New Roman" w:eastAsia="Times New Roman" w:hAnsi="Times New Roman" w:cs="Times New Roman"/>
+          <w:kern w:val="0"/>
+          <w:sz w:val="28"/>
+          <w:szCs w:val="28"/>
+          <w14:ligatures w14:val="none"/>
+        </w:rPr>
+      </w:pPr>
+      <w:r>
+        <w:rPr>
+          <w:rFonts w:ascii="Times New Roman" w:eastAsia="Times New Roman" w:hAnsi="Times New Roman" w:cs="Times New Roman"/>
+          <w:kern w:val="0"/>
+          <w:sz w:val="28"/>
+          <w:szCs w:val="28"/>
+          <w14:ligatures w14:val="none"/>
+        </w:rPr>
+        <w:t>Seed that is the most affordable</w:t>
+      </w:r>
+    </w:p>
+    <w:p>
+      <w:pPr>
+        <w:numPr>
+          <w:ilvl w:val="1"/>
+          <w:numId w:val="3"/>
+        </w:numPr>
+        <w:spacing w:before="100" w:beforeAutospacing="1" w:after="100" w:afterAutospacing="1" w:line="240" w:lineRule="auto"/>
+        <w:rPr>
+          <w:rFonts w:ascii="Times New Roman" w:eastAsia="Times New Roman" w:hAnsi="Times New Roman" w:cs="Times New Roman"/>
+          <w:kern w:val="0"/>
+          <w:sz w:val="28"/>
+          <w:szCs w:val="28"/>
+          <w14:ligatures w14:val="none"/>
+        </w:rPr>
+      </w:pPr>
+      <w:r>
+        <w:rPr>
+          <w:rFonts w:ascii="Times New Roman" w:eastAsia="Times New Roman" w:hAnsi="Times New Roman" w:cs="Times New Roman"/>
+          <w:kern w:val="0"/>
+          <w:sz w:val="28"/>
+          <w:szCs w:val="28"/>
+          <w14:ligatures w14:val="none"/>
+        </w:rPr>
+        <w:t>Seed that was recommended by store personnel/social media/news articles</w:t>
+      </w:r>
     </w:p>
     <w:p>
       <w:pPr>
@@ -7286,23 +7350,15 @@
       </w:pPr>
       <w:r>
         <w:rPr>
-          <w:rFonts w:ascii="Times New Roman" w:eastAsia="Times New Roman" w:hAnsi="Times New Roman" w:cs="Times New Roman"/>
           <w:noProof/>
-          <w:kern w:val="0"/>
-          <w:sz w:val="28"/>
-          <w:szCs w:val="28"/>
-        </w:rPr>
-      </w:r>
-      <w:r>
-        <w:rPr>
-          <w:rFonts w:ascii="Times New Roman" w:eastAsia="Times New Roman" w:hAnsi="Times New Roman" w:cs="Times New Roman"/>
-          <w:noProof/>
-          <w:kern w:val="0"/>
-          <w:sz w:val="28"/>
-          <w:szCs w:val="28"/>
-        </w:rPr>
-        <w:pict w14:anchorId="52FCE741">
-          <v:rect id="_x0000_i1031" alt="" style="width:468pt;height:.05pt;mso-width-percent:0;mso-height-percent:0;mso-width-percent:0;mso-height-percent:0" o:hralign="center" o:hrstd="t" o:hr="t" fillcolor="#a0a0a0" stroked="f"/>
+        </w:rPr>
+      </w:r>
+      <w:r>
+        <w:pict w14:anchorId="02FEF9AD">
+          <v:rect id="Horizontal Line 7" o:spid="_x0000_s1026" style="width:468pt;height:.05pt;visibility:visible;mso-wrap-style:square;mso-left-percent:-10001;mso-top-percent:-10001;mso-position-horizontal:absolute;mso-position-horizontal-relative:char;mso-position-vertical:absolute;mso-position-vertical-relative:line;mso-left-percent:-10001;mso-top-percent:-10001;v-text-anchor:top" o:gfxdata="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" filled="f">
+            <o:lock v:ext="edit" rotation="t" aspectratio="t" verticies="t" text="t" shapetype="t"/>
+            <w10:anchorlock/>
+          </v:rect>
         </w:pict>
       </w:r>
     </w:p>
@@ -7368,7 +7424,7 @@
         </w:rPr>
         <w:t>Finally, we have a few demographic questions. This information helps us understand who participates in</w:t>
       </w:r>
-      <w:ins w:id="112" w:author="Kelsey McCune" w:date="2026-03-02T09:06:00Z" w16du:dateUtc="2026-03-02T15:06:00Z">
+      <w:ins w:id="107" w:author="Kelsey McCune" w:date="2026-03-02T09:06:00Z" w16du:dateUtc="2026-03-02T15:06:00Z">
         <w:r>
           <w:rPr>
             <w:rFonts w:ascii="Times New Roman" w:eastAsia="Times New Roman" w:hAnsi="Times New Roman" w:cs="Times New Roman"/>
@@ -7394,7 +7450,7 @@
         </w:rPr>
         <w:t xml:space="preserve"> backyard </w:t>
       </w:r>
-      <w:del w:id="113" w:author="Kelsey McCune" w:date="2026-03-02T09:07:00Z" w16du:dateUtc="2026-03-02T15:07:00Z">
+      <w:del w:id="108" w:author="Kelsey McCune" w:date="2026-03-02T09:07:00Z" w16du:dateUtc="2026-03-02T15:07:00Z">
         <w:r>
           <w:rPr>
             <w:rFonts w:ascii="Times New Roman" w:eastAsia="Times New Roman" w:hAnsi="Times New Roman" w:cs="Times New Roman"/>
@@ -7408,7 +7464,7 @@
           <w:delText>wildlife feeding</w:delText>
         </w:r>
       </w:del>
-      <w:ins w:id="114" w:author="Kelsey McCune" w:date="2026-03-02T09:07:00Z" w16du:dateUtc="2026-03-02T15:07:00Z">
+      <w:ins w:id="109" w:author="Kelsey McCune" w:date="2026-03-02T09:07:00Z" w16du:dateUtc="2026-03-02T15:07:00Z">
         <w:r>
           <w:rPr>
             <w:rFonts w:ascii="Times New Roman" w:eastAsia="Times New Roman" w:hAnsi="Times New Roman" w:cs="Times New Roman"/>
@@ -7748,6 +7804,7 @@
           <w:szCs w:val="28"/>
           <w14:ligatures w14:val="none"/>
         </w:rPr>
+        <w:lastRenderedPageBreak/>
         <w:t xml:space="preserve">Education level: </w:t>
       </w:r>
       <w:r>
@@ -7770,60 +7827,7 @@
           <w:szCs w:val="28"/>
           <w14:ligatures w14:val="none"/>
         </w:rPr>
-        <w:t xml:space="preserve">Less than high school / High school diploma or GED / Some college / </w:t>
-      </w:r>
-      <w:proofErr w:type="gramStart"/>
-      <w:r>
-        <w:rPr>
-          <w:rFonts w:ascii="Times New Roman" w:eastAsia="Times New Roman" w:hAnsi="Times New Roman" w:cs="Times New Roman"/>
-          <w:i/>
-          <w:iCs/>
-          <w:kern w:val="0"/>
-          <w:sz w:val="28"/>
-          <w:szCs w:val="28"/>
-          <w14:ligatures w14:val="none"/>
-        </w:rPr>
-        <w:lastRenderedPageBreak/>
-        <w:t>Associate's</w:t>
-      </w:r>
-      <w:proofErr w:type="gramEnd"/>
-      <w:r>
-        <w:rPr>
-          <w:rFonts w:ascii="Times New Roman" w:eastAsia="Times New Roman" w:hAnsi="Times New Roman" w:cs="Times New Roman"/>
-          <w:i/>
-          <w:iCs/>
-          <w:kern w:val="0"/>
-          <w:sz w:val="28"/>
-          <w:szCs w:val="28"/>
-          <w14:ligatures w14:val="none"/>
-        </w:rPr>
-        <w:t xml:space="preserve"> degree / </w:t>
-      </w:r>
-      <w:proofErr w:type="gramStart"/>
-      <w:r>
-        <w:rPr>
-          <w:rFonts w:ascii="Times New Roman" w:eastAsia="Times New Roman" w:hAnsi="Times New Roman" w:cs="Times New Roman"/>
-          <w:i/>
-          <w:iCs/>
-          <w:kern w:val="0"/>
-          <w:sz w:val="28"/>
-          <w:szCs w:val="28"/>
-          <w14:ligatures w14:val="none"/>
-        </w:rPr>
-        <w:t>Bachelor's</w:t>
-      </w:r>
-      <w:proofErr w:type="gramEnd"/>
-      <w:r>
-        <w:rPr>
-          <w:rFonts w:ascii="Times New Roman" w:eastAsia="Times New Roman" w:hAnsi="Times New Roman" w:cs="Times New Roman"/>
-          <w:i/>
-          <w:iCs/>
-          <w:kern w:val="0"/>
-          <w:sz w:val="28"/>
-          <w:szCs w:val="28"/>
-          <w14:ligatures w14:val="none"/>
-        </w:rPr>
-        <w:t xml:space="preserve"> degree / Graduate or professional degree / Prefer not to say</w:t>
+        <w:t>Less than high school / High school diploma or GED / Some college / Associate's degree / Bachelor's degree / Graduate or professional degree / Prefer not to say</w:t>
       </w:r>
     </w:p>
     <w:p>
@@ -8214,7 +8218,7 @@
       </w:r>
     </w:p>
   </w:comment>
-  <w:comment w:id="31" w:author="Kelsey McCune" w:date="2026-03-02T08:36:00Z" w:initials="KBM">
+  <w:comment w:id="36" w:author="Kelsey McCune" w:date="2026-03-02T08:36:00Z" w:initials="KBM">
     <w:p>
       <w:r>
         <w:rPr>
@@ -8231,7 +8235,7 @@
       </w:r>
     </w:p>
   </w:comment>
-  <w:comment w:id="39" w:author="Kelsey McCune" w:date="2026-03-02T08:42:00Z" w:initials="KBM">
+  <w:comment w:id="46" w:author="Kelsey McCune" w:date="2026-03-02T08:42:00Z" w:initials="KBM">
     <w:p>
       <w:r>
         <w:rPr>
@@ -8248,7 +8252,7 @@
       </w:r>
     </w:p>
   </w:comment>
-  <w:comment w:id="41" w:author="Kelsey McCune" w:date="2026-03-02T08:43:00Z" w:initials="KBM">
+  <w:comment w:id="49" w:author="Kelsey McCune" w:date="2026-03-02T08:43:00Z" w:initials="KBM">
     <w:p>
       <w:r>
         <w:rPr>
@@ -8265,7 +8269,7 @@
       </w:r>
     </w:p>
   </w:comment>
-  <w:comment w:id="48" w:author="Kelsey McCune" w:date="2026-03-02T08:48:00Z" w:initials="KBM">
+  <w:comment w:id="56" w:author="Kelsey McCune" w:date="2026-03-02T08:48:00Z" w:initials="KBM">
     <w:p>
       <w:r>
         <w:rPr>
@@ -8282,7 +8286,7 @@
       </w:r>
     </w:p>
   </w:comment>
-  <w:comment w:id="68" w:author="Kelsey McCune" w:date="2026-03-02T08:53:00Z" w:initials="KBM">
+  <w:comment w:id="76" w:author="Kelsey McCune" w:date="2026-03-02T08:53:00Z" w:initials="KBM">
     <w:p>
       <w:r>
         <w:rPr>
@@ -8299,7 +8303,7 @@
       </w:r>
     </w:p>
   </w:comment>
-  <w:comment w:id="76" w:author="Kelsey McCune" w:date="2026-03-02T08:59:00Z" w:initials="KBM">
+  <w:comment w:id="84" w:author="Kelsey McCune" w:date="2026-03-02T08:59:00Z" w:initials="KBM">
     <w:p>
       <w:r>
         <w:rPr>
@@ -8316,7 +8320,7 @@
       </w:r>
     </w:p>
   </w:comment>
-  <w:comment w:id="86" w:author="Kelsey McCune" w:date="2026-03-02T09:02:00Z" w:initials="KBM">
+  <w:comment w:id="94" w:author="Kelsey McCune" w:date="2026-03-02T09:02:00Z" w:initials="KBM">
     <w:p>
       <w:r>
         <w:rPr>
@@ -10586,6 +10590,9 @@
 <w15:people xmlns:wpc="http://schemas.microsoft.com/office/word/2010/wordprocessingCanvas" xmlns:cx="http://schemas.microsoft.com/office/drawing/2014/chartex" xmlns:cx1="http://schemas.microsoft.com/office/drawing/2015/9/8/chartex" xmlns:cx2="http://schemas.microsoft.com/office/drawing/2015/10/21/chartex" xmlns:cx3="http://schemas.microsoft.com/office/drawing/2016/5/9/chartex" xmlns:cx4="http://schemas.microsoft.com/office/drawing/2016/5/10/chartex" xmlns:cx5="http://schemas.microsoft.com/office/drawing/2016/5/11/chartex" xmlns:cx6="http://schemas.microsoft.com/office/drawing/2016/5/12/chartex" xmlns:cx7="http://schemas.microsoft.com/office/drawing/2016/5/13/chartex" xmlns:cx8="http://schemas.microsoft.com/office/drawing/2016/5/14/chartex" xmlns:mc="http://schemas.openxmlformats.org/markup-compatibility/2006" xmlns:aink="http://schemas.microsoft.com/office/drawing/2016/ink" xmlns:am3d="http://schemas.microsoft.com/office/drawing/2017/model3d" xmlns:o="urn:schemas-microsoft-com:office:office" xmlns:oel="http://schemas.microsoft.com/office/2019/extlst" xmlns:r="http://schemas.openxmlformats.org/officeDocument/2006/relationships" xmlns:m="http://schemas.openxmlformats.org/officeDocument/2006/math" xmlns:v="urn:schemas-microsoft-com:vml" xmlns:wp14="http://schemas.microsoft.com/office/word/2010/wordprocessingDrawing" xmlns:wp="http://schemas.openxmlformats.org/drawingml/2006/wordprocessingDrawing" xmlns:w10="urn:schemas-microsoft-com:office:word" xmlns:w="http://schemas.openxmlformats.org/wordprocessingml/2006/main" xmlns:w14="http://schemas.microsoft.com/office/word/2010/wordml" xmlns:w15="http://schemas.microsoft.com/office/word/2012/wordml" xmlns:w16cex="http://schemas.microsoft.com/office/word/2018/wordml/cex" xmlns:w16cid="http://schemas.microsoft.com/office/word/2016/wordml/cid" xmlns:w16="http://schemas.microsoft.com/office/word/2018/wordml" xmlns:w16du="http://schemas.microsoft.com/office/word/2023/wordml/word16du" xmlns:w16sdtdh="http://schemas.microsoft.com/office/word/2020/wordml/sdtdatahash" xmlns:w16sdtfl="http://schemas.microsoft.com/office/word/2024/wordml/sdtformatlock" xmlns:w16se="http://schemas.microsoft.com/office/word/2015/wordml/symex" xmlns:wpg="http://schemas.microsoft.com/office/word/2010/wordprocessingGroup" xmlns:wpi="http://schemas.microsoft.com/office/word/2010/wordprocessingInk" xmlns:wne="http://schemas.microsoft.com/office/word/2006/wordml" xmlns:wps="http://schemas.microsoft.com/office/word/2010/wordprocessingShape" mc:Ignorable="w14 w15 w16se w16cid w16 w16cex w16sdtdh w16sdtfl w16du wp14">
   <w15:person w15:author="Kelsey McCune">
     <w15:presenceInfo w15:providerId="None" w15:userId="Kelsey McCune"/>
+  </w15:person>
+  <w15:person w15:author="Alex Fisher">
+    <w15:presenceInfo w15:providerId="AD" w15:userId="S::amf0080@auburn.edu::18480bde-8768-4851-bd71-24a6dd2d4725"/>
   </w15:person>
 </w15:people>
 </file>

</xml_diff>